<commit_message>
NAPIX integration notes and live samples
</commit_message>
<xml_diff>
--- a/docs/Legal_Case_Monitoring_Portal_Plan.docx
+++ b/docs/Legal_Case_Monitoring_Portal_Plan.docx
@@ -222,12 +222,6 @@
         <w:gridCol w:w="3726"/>
       </w:tblGrid>
       <w:tr>
-        <w:tblPrEx>
-          <w:tblCellMar>
-            <w:top w:w="0" w:type="dxa"/>
-            <w:bottom w:w="0" w:type="dxa"/>
-          </w:tblCellMar>
-        </w:tblPrEx>
         <w:trPr>
           <w:cantSplit/>
           <w:tblHeader/>
@@ -351,12 +345,6 @@
         </w:tc>
       </w:tr>
       <w:tr>
-        <w:tblPrEx>
-          <w:tblCellMar>
-            <w:top w:w="0" w:type="dxa"/>
-            <w:bottom w:w="0" w:type="dxa"/>
-          </w:tblCellMar>
-        </w:tblPrEx>
         <w:trPr>
           <w:cantSplit/>
         </w:trPr>
@@ -467,12 +455,6 @@
         </w:tc>
       </w:tr>
       <w:tr>
-        <w:tblPrEx>
-          <w:tblCellMar>
-            <w:top w:w="0" w:type="dxa"/>
-            <w:bottom w:w="0" w:type="dxa"/>
-          </w:tblCellMar>
-        </w:tblPrEx>
         <w:trPr>
           <w:cantSplit/>
         </w:trPr>
@@ -583,12 +565,6 @@
         </w:tc>
       </w:tr>
       <w:tr>
-        <w:tblPrEx>
-          <w:tblCellMar>
-            <w:top w:w="0" w:type="dxa"/>
-            <w:bottom w:w="0" w:type="dxa"/>
-          </w:tblCellMar>
-        </w:tblPrEx>
         <w:trPr>
           <w:cantSplit/>
         </w:trPr>
@@ -699,12 +675,6 @@
         </w:tc>
       </w:tr>
       <w:tr>
-        <w:tblPrEx>
-          <w:tblCellMar>
-            <w:top w:w="0" w:type="dxa"/>
-            <w:bottom w:w="0" w:type="dxa"/>
-          </w:tblCellMar>
-        </w:tblPrEx>
         <w:trPr>
           <w:cantSplit/>
         </w:trPr>
@@ -815,12 +785,6 @@
         </w:tc>
       </w:tr>
       <w:tr>
-        <w:tblPrEx>
-          <w:tblCellMar>
-            <w:top w:w="0" w:type="dxa"/>
-            <w:bottom w:w="0" w:type="dxa"/>
-          </w:tblCellMar>
-        </w:tblPrEx>
         <w:trPr>
           <w:cantSplit/>
         </w:trPr>
@@ -931,12 +895,6 @@
         </w:tc>
       </w:tr>
       <w:tr>
-        <w:tblPrEx>
-          <w:tblCellMar>
-            <w:top w:w="0" w:type="dxa"/>
-            <w:bottom w:w="0" w:type="dxa"/>
-          </w:tblCellMar>
-        </w:tblPrEx>
         <w:trPr>
           <w:cantSplit/>
         </w:trPr>
@@ -1047,12 +1005,6 @@
         </w:tc>
       </w:tr>
       <w:tr>
-        <w:tblPrEx>
-          <w:tblCellMar>
-            <w:top w:w="0" w:type="dxa"/>
-            <w:bottom w:w="0" w:type="dxa"/>
-          </w:tblCellMar>
-        </w:tblPrEx>
         <w:trPr>
           <w:cantSplit/>
         </w:trPr>
@@ -1163,12 +1115,6 @@
         </w:tc>
       </w:tr>
       <w:tr>
-        <w:tblPrEx>
-          <w:tblCellMar>
-            <w:top w:w="0" w:type="dxa"/>
-            <w:bottom w:w="0" w:type="dxa"/>
-          </w:tblCellMar>
-        </w:tblPrEx>
         <w:trPr>
           <w:cantSplit/>
         </w:trPr>
@@ -1375,7 +1321,7 @@
                     </pic:cNvPicPr>
                   </pic:nvPicPr>
                   <pic:blipFill>
-                    <a:blip r:embed="rId7"/>
+                    <a:blip r:embed="rId8"/>
                     <a:srcRect/>
                     <a:stretch>
                       <a:fillRect/>
@@ -1460,12 +1406,6 @@
         <w:gridCol w:w="6726"/>
       </w:tblGrid>
       <w:tr>
-        <w:tblPrEx>
-          <w:tblCellMar>
-            <w:top w:w="0" w:type="dxa"/>
-            <w:bottom w:w="0" w:type="dxa"/>
-          </w:tblCellMar>
-        </w:tblPrEx>
         <w:trPr>
           <w:cantSplit/>
           <w:tblHeader/>
@@ -1550,12 +1490,6 @@
         </w:tc>
       </w:tr>
       <w:tr>
-        <w:tblPrEx>
-          <w:tblCellMar>
-            <w:top w:w="0" w:type="dxa"/>
-            <w:bottom w:w="0" w:type="dxa"/>
-          </w:tblCellMar>
-        </w:tblPrEx>
         <w:trPr>
           <w:cantSplit/>
         </w:trPr>
@@ -1631,12 +1565,6 @@
         </w:tc>
       </w:tr>
       <w:tr>
-        <w:tblPrEx>
-          <w:tblCellMar>
-            <w:top w:w="0" w:type="dxa"/>
-            <w:bottom w:w="0" w:type="dxa"/>
-          </w:tblCellMar>
-        </w:tblPrEx>
         <w:trPr>
           <w:cantSplit/>
         </w:trPr>
@@ -1712,12 +1640,6 @@
         </w:tc>
       </w:tr>
       <w:tr>
-        <w:tblPrEx>
-          <w:tblCellMar>
-            <w:top w:w="0" w:type="dxa"/>
-            <w:bottom w:w="0" w:type="dxa"/>
-          </w:tblCellMar>
-        </w:tblPrEx>
         <w:trPr>
           <w:cantSplit/>
         </w:trPr>
@@ -1794,12 +1716,6 @@
         </w:tc>
       </w:tr>
       <w:tr>
-        <w:tblPrEx>
-          <w:tblCellMar>
-            <w:top w:w="0" w:type="dxa"/>
-            <w:bottom w:w="0" w:type="dxa"/>
-          </w:tblCellMar>
-        </w:tblPrEx>
         <w:trPr>
           <w:cantSplit/>
         </w:trPr>
@@ -1875,12 +1791,6 @@
         </w:tc>
       </w:tr>
       <w:tr>
-        <w:tblPrEx>
-          <w:tblCellMar>
-            <w:top w:w="0" w:type="dxa"/>
-            <w:bottom w:w="0" w:type="dxa"/>
-          </w:tblCellMar>
-        </w:tblPrEx>
         <w:trPr>
           <w:cantSplit/>
         </w:trPr>
@@ -1956,12 +1866,6 @@
         </w:tc>
       </w:tr>
       <w:tr>
-        <w:tblPrEx>
-          <w:tblCellMar>
-            <w:top w:w="0" w:type="dxa"/>
-            <w:bottom w:w="0" w:type="dxa"/>
-          </w:tblCellMar>
-        </w:tblPrEx>
         <w:trPr>
           <w:cantSplit/>
         </w:trPr>
@@ -2100,12 +2004,6 @@
         <w:gridCol w:w="6026"/>
       </w:tblGrid>
       <w:tr>
-        <w:tblPrEx>
-          <w:tblCellMar>
-            <w:top w:w="0" w:type="dxa"/>
-            <w:bottom w:w="0" w:type="dxa"/>
-          </w:tblCellMar>
-        </w:tblPrEx>
         <w:trPr>
           <w:cantSplit/>
           <w:tblHeader/>
@@ -2190,12 +2088,6 @@
         </w:tc>
       </w:tr>
       <w:tr>
-        <w:tblPrEx>
-          <w:tblCellMar>
-            <w:top w:w="0" w:type="dxa"/>
-            <w:bottom w:w="0" w:type="dxa"/>
-          </w:tblCellMar>
-        </w:tblPrEx>
         <w:trPr>
           <w:cantSplit/>
         </w:trPr>
@@ -2271,12 +2163,6 @@
         </w:tc>
       </w:tr>
       <w:tr>
-        <w:tblPrEx>
-          <w:tblCellMar>
-            <w:top w:w="0" w:type="dxa"/>
-            <w:bottom w:w="0" w:type="dxa"/>
-          </w:tblCellMar>
-        </w:tblPrEx>
         <w:trPr>
           <w:cantSplit/>
         </w:trPr>
@@ -2352,12 +2238,6 @@
         </w:tc>
       </w:tr>
       <w:tr>
-        <w:tblPrEx>
-          <w:tblCellMar>
-            <w:top w:w="0" w:type="dxa"/>
-            <w:bottom w:w="0" w:type="dxa"/>
-          </w:tblCellMar>
-        </w:tblPrEx>
         <w:trPr>
           <w:cantSplit/>
         </w:trPr>
@@ -2433,12 +2313,6 @@
         </w:tc>
       </w:tr>
       <w:tr>
-        <w:tblPrEx>
-          <w:tblCellMar>
-            <w:top w:w="0" w:type="dxa"/>
-            <w:bottom w:w="0" w:type="dxa"/>
-          </w:tblCellMar>
-        </w:tblPrEx>
         <w:trPr>
           <w:cantSplit/>
         </w:trPr>
@@ -2514,12 +2388,6 @@
         </w:tc>
       </w:tr>
       <w:tr>
-        <w:tblPrEx>
-          <w:tblCellMar>
-            <w:top w:w="0" w:type="dxa"/>
-            <w:bottom w:w="0" w:type="dxa"/>
-          </w:tblCellMar>
-        </w:tblPrEx>
         <w:trPr>
           <w:cantSplit/>
         </w:trPr>
@@ -2595,12 +2463,6 @@
         </w:tc>
       </w:tr>
       <w:tr>
-        <w:tblPrEx>
-          <w:tblCellMar>
-            <w:top w:w="0" w:type="dxa"/>
-            <w:bottom w:w="0" w:type="dxa"/>
-          </w:tblCellMar>
-        </w:tblPrEx>
         <w:trPr>
           <w:cantSplit/>
         </w:trPr>
@@ -2676,12 +2538,6 @@
         </w:tc>
       </w:tr>
       <w:tr>
-        <w:tblPrEx>
-          <w:tblCellMar>
-            <w:top w:w="0" w:type="dxa"/>
-            <w:bottom w:w="0" w:type="dxa"/>
-          </w:tblCellMar>
-        </w:tblPrEx>
         <w:trPr>
           <w:cantSplit/>
         </w:trPr>
@@ -2757,12 +2613,6 @@
         </w:tc>
       </w:tr>
       <w:tr>
-        <w:tblPrEx>
-          <w:tblCellMar>
-            <w:top w:w="0" w:type="dxa"/>
-            <w:bottom w:w="0" w:type="dxa"/>
-          </w:tblCellMar>
-        </w:tblPrEx>
         <w:trPr>
           <w:cantSplit/>
         </w:trPr>
@@ -2941,12 +2791,6 @@
         <w:gridCol w:w="2226"/>
       </w:tblGrid>
       <w:tr>
-        <w:tblPrEx>
-          <w:tblCellMar>
-            <w:top w:w="0" w:type="dxa"/>
-            <w:bottom w:w="0" w:type="dxa"/>
-          </w:tblCellMar>
-        </w:tblPrEx>
         <w:trPr>
           <w:cantSplit/>
           <w:tblHeader/>
@@ -3109,12 +2953,6 @@
         </w:tc>
       </w:tr>
       <w:tr>
-        <w:tblPrEx>
-          <w:tblCellMar>
-            <w:top w:w="0" w:type="dxa"/>
-            <w:bottom w:w="0" w:type="dxa"/>
-          </w:tblCellMar>
-        </w:tblPrEx>
         <w:trPr>
           <w:cantSplit/>
         </w:trPr>
@@ -3260,12 +3098,6 @@
         </w:tc>
       </w:tr>
       <w:tr>
-        <w:tblPrEx>
-          <w:tblCellMar>
-            <w:top w:w="0" w:type="dxa"/>
-            <w:bottom w:w="0" w:type="dxa"/>
-          </w:tblCellMar>
-        </w:tblPrEx>
         <w:trPr>
           <w:cantSplit/>
         </w:trPr>
@@ -3411,12 +3243,6 @@
         </w:tc>
       </w:tr>
       <w:tr>
-        <w:tblPrEx>
-          <w:tblCellMar>
-            <w:top w:w="0" w:type="dxa"/>
-            <w:bottom w:w="0" w:type="dxa"/>
-          </w:tblCellMar>
-        </w:tblPrEx>
         <w:trPr>
           <w:cantSplit/>
         </w:trPr>
@@ -3562,12 +3388,6 @@
         </w:tc>
       </w:tr>
       <w:tr>
-        <w:tblPrEx>
-          <w:tblCellMar>
-            <w:top w:w="0" w:type="dxa"/>
-            <w:bottom w:w="0" w:type="dxa"/>
-          </w:tblCellMar>
-        </w:tblPrEx>
         <w:trPr>
           <w:cantSplit/>
         </w:trPr>
@@ -3714,12 +3534,6 @@
         </w:tc>
       </w:tr>
       <w:tr>
-        <w:tblPrEx>
-          <w:tblCellMar>
-            <w:top w:w="0" w:type="dxa"/>
-            <w:bottom w:w="0" w:type="dxa"/>
-          </w:tblCellMar>
-        </w:tblPrEx>
         <w:trPr>
           <w:cantSplit/>
         </w:trPr>
@@ -3865,12 +3679,6 @@
         </w:tc>
       </w:tr>
       <w:tr>
-        <w:tblPrEx>
-          <w:tblCellMar>
-            <w:top w:w="0" w:type="dxa"/>
-            <w:bottom w:w="0" w:type="dxa"/>
-          </w:tblCellMar>
-        </w:tblPrEx>
         <w:trPr>
           <w:cantSplit/>
         </w:trPr>
@@ -4016,12 +3824,6 @@
         </w:tc>
       </w:tr>
       <w:tr>
-        <w:tblPrEx>
-          <w:tblCellMar>
-            <w:top w:w="0" w:type="dxa"/>
-            <w:bottom w:w="0" w:type="dxa"/>
-          </w:tblCellMar>
-        </w:tblPrEx>
         <w:trPr>
           <w:cantSplit/>
         </w:trPr>
@@ -4167,12 +3969,6 @@
         </w:tc>
       </w:tr>
       <w:tr>
-        <w:tblPrEx>
-          <w:tblCellMar>
-            <w:top w:w="0" w:type="dxa"/>
-            <w:bottom w:w="0" w:type="dxa"/>
-          </w:tblCellMar>
-        </w:tblPrEx>
         <w:trPr>
           <w:cantSplit/>
         </w:trPr>
@@ -4318,12 +4114,6 @@
         </w:tc>
       </w:tr>
       <w:tr>
-        <w:tblPrEx>
-          <w:tblCellMar>
-            <w:top w:w="0" w:type="dxa"/>
-            <w:bottom w:w="0" w:type="dxa"/>
-          </w:tblCellMar>
-        </w:tblPrEx>
         <w:trPr>
           <w:cantSplit/>
         </w:trPr>
@@ -4469,12 +4259,6 @@
         </w:tc>
       </w:tr>
       <w:tr>
-        <w:tblPrEx>
-          <w:tblCellMar>
-            <w:top w:w="0" w:type="dxa"/>
-            <w:bottom w:w="0" w:type="dxa"/>
-          </w:tblCellMar>
-        </w:tblPrEx>
         <w:trPr>
           <w:cantSplit/>
         </w:trPr>
@@ -4623,7 +4407,7 @@
     <w:p>
       <w:pPr>
         <w:spacing w:before="60" w:after="240"/>
-        <w:jc w:val="both"/>
+        <w:jc w:val="center"/>
         <w:rPr>
           <w:rFonts w:asciiTheme="minorHAnsi" w:hAnsiTheme="minorHAnsi"/>
           <w:sz w:val="20"/>
@@ -4762,12 +4546,6 @@
         <w:gridCol w:w="1826"/>
       </w:tblGrid>
       <w:tr>
-        <w:tblPrEx>
-          <w:tblCellMar>
-            <w:top w:w="0" w:type="dxa"/>
-            <w:bottom w:w="0" w:type="dxa"/>
-          </w:tblCellMar>
-        </w:tblPrEx>
         <w:trPr>
           <w:cantSplit/>
           <w:tblHeader/>
@@ -4930,12 +4708,6 @@
         </w:tc>
       </w:tr>
       <w:tr>
-        <w:tblPrEx>
-          <w:tblCellMar>
-            <w:top w:w="0" w:type="dxa"/>
-            <w:bottom w:w="0" w:type="dxa"/>
-          </w:tblCellMar>
-        </w:tblPrEx>
         <w:trPr>
           <w:cantSplit/>
         </w:trPr>
@@ -5081,12 +4853,6 @@
         </w:tc>
       </w:tr>
       <w:tr>
-        <w:tblPrEx>
-          <w:tblCellMar>
-            <w:top w:w="0" w:type="dxa"/>
-            <w:bottom w:w="0" w:type="dxa"/>
-          </w:tblCellMar>
-        </w:tblPrEx>
         <w:trPr>
           <w:cantSplit/>
         </w:trPr>
@@ -5445,352 +5211,6 @@
             <wp:extent cx="5334000" cy="2552700"/>
             <wp:effectExtent l="0" t="0" r="0" b="0"/>
             <wp:docPr id="1915462780" name="Picture 1915462780"/>
-            <wp:cNvGraphicFramePr>
-              <a:graphicFrameLocks xmlns:a="http://schemas.openxmlformats.org/drawingml/2006/main" noChangeAspect="1"/>
-            </wp:cNvGraphicFramePr>
-            <a:graphic xmlns:a="http://schemas.openxmlformats.org/drawingml/2006/main">
-              <a:graphicData uri="http://schemas.openxmlformats.org/drawingml/2006/picture">
-                <pic:pic xmlns:pic="http://schemas.openxmlformats.org/drawingml/2006/picture">
-                  <pic:nvPicPr>
-                    <pic:cNvPr id="0" name=""/>
-                    <pic:cNvPicPr>
-                      <a:picLocks noChangeAspect="1" noChangeArrowheads="1"/>
-                    </pic:cNvPicPr>
-                  </pic:nvPicPr>
-                  <pic:blipFill>
-                    <a:blip r:embed="rId8"/>
-                    <a:srcRect/>
-                    <a:stretch>
-                      <a:fillRect/>
-                    </a:stretch>
-                  </pic:blipFill>
-                  <pic:spPr bwMode="auto">
-                    <a:xfrm>
-                      <a:off x="0" y="0"/>
-                      <a:ext cx="5334000" cy="2552700"/>
-                    </a:xfrm>
-                    <a:prstGeom prst="rect">
-                      <a:avLst/>
-                    </a:prstGeom>
-                  </pic:spPr>
-                </pic:pic>
-              </a:graphicData>
-            </a:graphic>
-          </wp:inline>
-        </w:drawing>
-      </w:r>
-    </w:p>
-    <w:p>
-      <w:pPr>
-        <w:spacing w:before="60" w:after="240"/>
-        <w:jc w:val="center"/>
-        <w:rPr>
-          <w:rFonts w:asciiTheme="minorHAnsi" w:hAnsiTheme="minorHAnsi"/>
-          <w:sz w:val="20"/>
-          <w:szCs w:val="20"/>
-        </w:rPr>
-      </w:pPr>
-      <w:r>
-        <w:rPr>
-          <w:rFonts w:asciiTheme="minorHAnsi" w:hAnsiTheme="minorHAnsi"/>
-          <w:i/>
-          <w:iCs/>
-          <w:color w:val="555555"/>
-          <w:sz w:val="20"/>
-          <w:szCs w:val="20"/>
-        </w:rPr>
-        <w:t>Figure 2: Automatic ingestion of court orders into SourceTrace</w:t>
-      </w:r>
-    </w:p>
-    <w:p>
-      <w:pPr>
-        <w:pStyle w:val="Heading1"/>
-        <w:jc w:val="both"/>
-        <w:rPr>
-          <w:rFonts w:asciiTheme="minorHAnsi" w:hAnsiTheme="minorHAnsi"/>
-          <w:sz w:val="20"/>
-          <w:szCs w:val="20"/>
-        </w:rPr>
-      </w:pPr>
-      <w:r>
-        <w:rPr>
-          <w:rFonts w:asciiTheme="minorHAnsi" w:hAnsiTheme="minorHAnsi"/>
-          <w:sz w:val="20"/>
-          <w:szCs w:val="20"/>
-        </w:rPr>
-        <w:t>4. Department Case Mapping</w:t>
-      </w:r>
-    </w:p>
-    <w:p>
-      <w:pPr>
-        <w:spacing w:after="120" w:line="276" w:lineRule="auto"/>
-        <w:jc w:val="both"/>
-        <w:rPr>
-          <w:rFonts w:asciiTheme="minorHAnsi" w:hAnsiTheme="minorHAnsi"/>
-          <w:sz w:val="20"/>
-          <w:szCs w:val="20"/>
-        </w:rPr>
-      </w:pPr>
-      <w:r>
-        <w:rPr>
-          <w:rFonts w:asciiTheme="minorHAnsi" w:hAnsiTheme="minorHAnsi"/>
-          <w:sz w:val="20"/>
-          <w:szCs w:val="20"/>
-        </w:rPr>
-        <w:t xml:space="preserve">Each day's cause list contains </w:t>
-      </w:r>
-      <w:r>
-        <w:rPr>
-          <w:rFonts w:asciiTheme="minorHAnsi" w:hAnsiTheme="minorHAnsi"/>
-          <w:sz w:val="20"/>
-          <w:szCs w:val="20"/>
-        </w:rPr>
-        <w:t>many</w:t>
-      </w:r>
-      <w:r>
-        <w:rPr>
-          <w:rFonts w:asciiTheme="minorHAnsi" w:hAnsiTheme="minorHAnsi"/>
-          <w:sz w:val="20"/>
-          <w:szCs w:val="20"/>
-        </w:rPr>
-        <w:t xml:space="preserve"> cases of all kinds, of which only some concern a given department. The mapping function recommends each case to the department it most likely belongs to, so that departments mainly see their own cases. No case is assigned automatically: a case becomes a department's case only when the department claims it.</w:t>
-      </w:r>
-    </w:p>
-    <w:p>
-      <w:pPr>
-        <w:pStyle w:val="Heading2"/>
-        <w:jc w:val="both"/>
-        <w:rPr>
-          <w:rFonts w:asciiTheme="minorHAnsi" w:hAnsiTheme="minorHAnsi"/>
-          <w:sz w:val="20"/>
-          <w:szCs w:val="20"/>
-        </w:rPr>
-      </w:pPr>
-      <w:r>
-        <w:rPr>
-          <w:rFonts w:asciiTheme="minorHAnsi" w:hAnsiTheme="minorHAnsi"/>
-          <w:sz w:val="20"/>
-          <w:szCs w:val="20"/>
-        </w:rPr>
-        <w:t>4.1 Codes and signals</w:t>
-      </w:r>
-    </w:p>
-    <w:p>
-      <w:pPr>
-        <w:spacing w:after="120" w:line="276" w:lineRule="auto"/>
-        <w:jc w:val="both"/>
-        <w:rPr>
-          <w:rFonts w:asciiTheme="minorHAnsi" w:hAnsiTheme="minorHAnsi"/>
-          <w:sz w:val="20"/>
-          <w:szCs w:val="20"/>
-        </w:rPr>
-      </w:pPr>
-      <w:r>
-        <w:rPr>
-          <w:rFonts w:asciiTheme="minorHAnsi" w:hAnsiTheme="minorHAnsi"/>
-          <w:sz w:val="20"/>
-          <w:szCs w:val="20"/>
-        </w:rPr>
-        <w:t>Gauhati High Court cause lists show who appears for the government, usually as a standing counsel code in the advocate column (for example, “SC, EDU” or “PP, ASSAM”). Each code is mapped to its department in the administration module. The system scores every case for every department using the following signals:</w:t>
-      </w:r>
-    </w:p>
-    <w:p>
-      <w:pPr>
-        <w:pStyle w:val="ListParagraph"/>
-        <w:numPr>
-          <w:ilvl w:val="0"/>
-          <w:numId w:val="2"/>
-        </w:numPr>
-        <w:spacing w:after="70" w:line="270" w:lineRule="auto"/>
-        <w:jc w:val="both"/>
-        <w:rPr>
-          <w:rFonts w:asciiTheme="minorHAnsi" w:hAnsiTheme="minorHAnsi"/>
-          <w:sz w:val="20"/>
-          <w:szCs w:val="20"/>
-        </w:rPr>
-      </w:pPr>
-      <w:r>
-        <w:rPr>
-          <w:rFonts w:asciiTheme="minorHAnsi" w:hAnsiTheme="minorHAnsi"/>
-          <w:b/>
-          <w:bCs/>
-          <w:sz w:val="20"/>
-          <w:szCs w:val="20"/>
-        </w:rPr>
-        <w:t xml:space="preserve">Standing counsel code: </w:t>
-      </w:r>
-      <w:r>
-        <w:rPr>
-          <w:rFonts w:asciiTheme="minorHAnsi" w:hAnsiTheme="minorHAnsi"/>
-          <w:sz w:val="20"/>
-          <w:szCs w:val="20"/>
-        </w:rPr>
-        <w:t>a mapped code in the cause list entry. This is the strongest signal.</w:t>
-      </w:r>
-    </w:p>
-    <w:p>
-      <w:pPr>
-        <w:pStyle w:val="ListParagraph"/>
-        <w:numPr>
-          <w:ilvl w:val="0"/>
-          <w:numId w:val="2"/>
-        </w:numPr>
-        <w:spacing w:after="70" w:line="270" w:lineRule="auto"/>
-        <w:jc w:val="both"/>
-        <w:rPr>
-          <w:rFonts w:asciiTheme="minorHAnsi" w:hAnsiTheme="minorHAnsi"/>
-          <w:sz w:val="20"/>
-          <w:szCs w:val="20"/>
-        </w:rPr>
-      </w:pPr>
-      <w:r>
-        <w:rPr>
-          <w:rFonts w:asciiTheme="minorHAnsi" w:hAnsiTheme="minorHAnsi"/>
-          <w:b/>
-          <w:bCs/>
-          <w:sz w:val="20"/>
-          <w:szCs w:val="20"/>
-        </w:rPr>
-        <w:t xml:space="preserve">Keywords and name patterns: </w:t>
-      </w:r>
-      <w:r>
-        <w:rPr>
-          <w:rFonts w:asciiTheme="minorHAnsi" w:hAnsiTheme="minorHAnsi"/>
-          <w:sz w:val="20"/>
-          <w:szCs w:val="20"/>
-        </w:rPr>
-        <w:t>department names and designations appearing in the party names (for example, “Director of Secondary Education”).</w:t>
-      </w:r>
-    </w:p>
-    <w:p>
-      <w:pPr>
-        <w:pStyle w:val="ListParagraph"/>
-        <w:numPr>
-          <w:ilvl w:val="0"/>
-          <w:numId w:val="2"/>
-        </w:numPr>
-        <w:spacing w:after="70" w:line="270" w:lineRule="auto"/>
-        <w:jc w:val="both"/>
-        <w:rPr>
-          <w:rFonts w:asciiTheme="minorHAnsi" w:hAnsiTheme="minorHAnsi"/>
-          <w:sz w:val="20"/>
-          <w:szCs w:val="20"/>
-        </w:rPr>
-      </w:pPr>
-      <w:r>
-        <w:rPr>
-          <w:rFonts w:asciiTheme="minorHAnsi" w:hAnsiTheme="minorHAnsi"/>
-          <w:b/>
-          <w:bCs/>
-          <w:sz w:val="20"/>
-          <w:szCs w:val="20"/>
-        </w:rPr>
-        <w:t xml:space="preserve">Linked-case history: </w:t>
-      </w:r>
-      <w:r>
-        <w:rPr>
-          <w:rFonts w:asciiTheme="minorHAnsi" w:hAnsiTheme="minorHAnsi"/>
-          <w:sz w:val="20"/>
-          <w:szCs w:val="20"/>
-        </w:rPr>
-        <w:t>if a related case, such as the original case behind an appeal, has already been claimed by a department, the new case leans toward that department.</w:t>
-      </w:r>
-    </w:p>
-    <w:p>
-      <w:pPr>
-        <w:pStyle w:val="ListParagraph"/>
-        <w:numPr>
-          <w:ilvl w:val="0"/>
-          <w:numId w:val="2"/>
-        </w:numPr>
-        <w:spacing w:after="70" w:line="270" w:lineRule="auto"/>
-        <w:jc w:val="both"/>
-        <w:rPr>
-          <w:rFonts w:asciiTheme="minorHAnsi" w:hAnsiTheme="minorHAnsi"/>
-          <w:sz w:val="20"/>
-          <w:szCs w:val="20"/>
-        </w:rPr>
-      </w:pPr>
-      <w:r>
-        <w:rPr>
-          <w:rFonts w:asciiTheme="minorHAnsi" w:hAnsiTheme="minorHAnsi"/>
-          <w:b/>
-          <w:bCs/>
-          <w:sz w:val="20"/>
-          <w:szCs w:val="20"/>
-        </w:rPr>
-        <w:t xml:space="preserve">Watchlist: </w:t>
-      </w:r>
-      <w:r>
-        <w:rPr>
-          <w:rFonts w:asciiTheme="minorHAnsi" w:hAnsiTheme="minorHAnsi"/>
-          <w:sz w:val="20"/>
-          <w:szCs w:val="20"/>
-        </w:rPr>
-        <w:t>specific cases a department has asked to follow.</w:t>
-      </w:r>
-    </w:p>
-    <w:p>
-      <w:pPr>
-        <w:pStyle w:val="Heading2"/>
-        <w:jc w:val="both"/>
-        <w:rPr>
-          <w:rFonts w:asciiTheme="minorHAnsi" w:hAnsiTheme="minorHAnsi"/>
-          <w:sz w:val="20"/>
-          <w:szCs w:val="20"/>
-        </w:rPr>
-      </w:pPr>
-      <w:r>
-        <w:rPr>
-          <w:rFonts w:asciiTheme="minorHAnsi" w:hAnsiTheme="minorHAnsi"/>
-          <w:sz w:val="20"/>
-          <w:szCs w:val="20"/>
-        </w:rPr>
-        <w:lastRenderedPageBreak/>
-        <w:t>4.2 Probability score and recommendations</w:t>
-      </w:r>
-    </w:p>
-    <w:p>
-      <w:pPr>
-        <w:spacing w:after="120" w:line="276" w:lineRule="auto"/>
-        <w:jc w:val="both"/>
-        <w:rPr>
-          <w:rFonts w:asciiTheme="minorHAnsi" w:hAnsiTheme="minorHAnsi"/>
-          <w:sz w:val="20"/>
-          <w:szCs w:val="20"/>
-        </w:rPr>
-      </w:pPr>
-      <w:r>
-        <w:rPr>
-          <w:rFonts w:asciiTheme="minorHAnsi" w:hAnsiTheme="minorHAnsi"/>
-          <w:sz w:val="20"/>
-          <w:szCs w:val="20"/>
-        </w:rPr>
-        <w:t>The signals are combined into a score between 0 and 1 for each department, and the score decides how prominently the case is recommended to each department, as shown in Figure 3 and Table 6. In every case, the department decides by claiming it.</w:t>
-      </w:r>
-    </w:p>
-    <w:p>
-      <w:pPr>
-        <w:spacing w:before="120" w:after="60"/>
-        <w:jc w:val="both"/>
-        <w:rPr>
-          <w:rFonts w:asciiTheme="minorHAnsi" w:hAnsiTheme="minorHAnsi"/>
-          <w:sz w:val="20"/>
-          <w:szCs w:val="20"/>
-        </w:rPr>
-      </w:pPr>
-      <w:r>
-        <w:rPr>
-          <w:rFonts w:asciiTheme="minorHAnsi" w:hAnsiTheme="minorHAnsi"/>
-          <w:noProof/>
-          <w:sz w:val="20"/>
-          <w:szCs w:val="20"/>
-        </w:rPr>
-        <w:drawing>
-          <wp:inline distT="0" distB="0" distL="0" distR="0" wp14:anchorId="31DAD869" wp14:editId="33AD01B2">
-            <wp:extent cx="5524500" cy="3695700"/>
-            <wp:effectExtent l="0" t="0" r="0" b="0"/>
-            <wp:docPr id="2020312856" name="Picture 2020312856"/>
             <wp:cNvGraphicFramePr>
               <a:graphicFrameLocks xmlns:a="http://schemas.openxmlformats.org/drawingml/2006/main" noChangeAspect="1"/>
             </wp:cNvGraphicFramePr>
@@ -5813,6 +5233,352 @@
                   <pic:spPr bwMode="auto">
                     <a:xfrm>
                       <a:off x="0" y="0"/>
+                      <a:ext cx="5334000" cy="2552700"/>
+                    </a:xfrm>
+                    <a:prstGeom prst="rect">
+                      <a:avLst/>
+                    </a:prstGeom>
+                  </pic:spPr>
+                </pic:pic>
+              </a:graphicData>
+            </a:graphic>
+          </wp:inline>
+        </w:drawing>
+      </w:r>
+    </w:p>
+    <w:p>
+      <w:pPr>
+        <w:spacing w:before="60" w:after="240"/>
+        <w:jc w:val="center"/>
+        <w:rPr>
+          <w:rFonts w:asciiTheme="minorHAnsi" w:hAnsiTheme="minorHAnsi"/>
+          <w:sz w:val="20"/>
+          <w:szCs w:val="20"/>
+        </w:rPr>
+      </w:pPr>
+      <w:r>
+        <w:rPr>
+          <w:rFonts w:asciiTheme="minorHAnsi" w:hAnsiTheme="minorHAnsi"/>
+          <w:i/>
+          <w:iCs/>
+          <w:color w:val="555555"/>
+          <w:sz w:val="20"/>
+          <w:szCs w:val="20"/>
+        </w:rPr>
+        <w:t>Figure 2: Automatic ingestion of court orders into SourceTrace</w:t>
+      </w:r>
+    </w:p>
+    <w:p>
+      <w:pPr>
+        <w:pStyle w:val="Heading1"/>
+        <w:jc w:val="both"/>
+        <w:rPr>
+          <w:rFonts w:asciiTheme="minorHAnsi" w:hAnsiTheme="minorHAnsi"/>
+          <w:sz w:val="20"/>
+          <w:szCs w:val="20"/>
+        </w:rPr>
+      </w:pPr>
+      <w:r>
+        <w:rPr>
+          <w:rFonts w:asciiTheme="minorHAnsi" w:hAnsiTheme="minorHAnsi"/>
+          <w:sz w:val="20"/>
+          <w:szCs w:val="20"/>
+        </w:rPr>
+        <w:t>4. Department Case Mapping</w:t>
+      </w:r>
+    </w:p>
+    <w:p>
+      <w:pPr>
+        <w:spacing w:after="120" w:line="276" w:lineRule="auto"/>
+        <w:jc w:val="both"/>
+        <w:rPr>
+          <w:rFonts w:asciiTheme="minorHAnsi" w:hAnsiTheme="minorHAnsi"/>
+          <w:sz w:val="20"/>
+          <w:szCs w:val="20"/>
+        </w:rPr>
+      </w:pPr>
+      <w:r>
+        <w:rPr>
+          <w:rFonts w:asciiTheme="minorHAnsi" w:hAnsiTheme="minorHAnsi"/>
+          <w:sz w:val="20"/>
+          <w:szCs w:val="20"/>
+        </w:rPr>
+        <w:t xml:space="preserve">Each day's cause list contains </w:t>
+      </w:r>
+      <w:r>
+        <w:rPr>
+          <w:rFonts w:asciiTheme="minorHAnsi" w:hAnsiTheme="minorHAnsi"/>
+          <w:sz w:val="20"/>
+          <w:szCs w:val="20"/>
+        </w:rPr>
+        <w:t>many</w:t>
+      </w:r>
+      <w:r>
+        <w:rPr>
+          <w:rFonts w:asciiTheme="minorHAnsi" w:hAnsiTheme="minorHAnsi"/>
+          <w:sz w:val="20"/>
+          <w:szCs w:val="20"/>
+        </w:rPr>
+        <w:t xml:space="preserve"> cases of all kinds, of which only some concern a given department. The mapping function recommends each case to the department it most likely belongs to, so that departments mainly see their own cases. No case is assigned automatically: a case becomes a department's case only when the department claims it.</w:t>
+      </w:r>
+    </w:p>
+    <w:p>
+      <w:pPr>
+        <w:pStyle w:val="Heading2"/>
+        <w:jc w:val="both"/>
+        <w:rPr>
+          <w:rFonts w:asciiTheme="minorHAnsi" w:hAnsiTheme="minorHAnsi"/>
+          <w:sz w:val="20"/>
+          <w:szCs w:val="20"/>
+        </w:rPr>
+      </w:pPr>
+      <w:r>
+        <w:rPr>
+          <w:rFonts w:asciiTheme="minorHAnsi" w:hAnsiTheme="minorHAnsi"/>
+          <w:sz w:val="20"/>
+          <w:szCs w:val="20"/>
+        </w:rPr>
+        <w:t>4.1 Codes and signals</w:t>
+      </w:r>
+    </w:p>
+    <w:p>
+      <w:pPr>
+        <w:spacing w:after="120" w:line="276" w:lineRule="auto"/>
+        <w:jc w:val="both"/>
+        <w:rPr>
+          <w:rFonts w:asciiTheme="minorHAnsi" w:hAnsiTheme="minorHAnsi"/>
+          <w:sz w:val="20"/>
+          <w:szCs w:val="20"/>
+        </w:rPr>
+      </w:pPr>
+      <w:r>
+        <w:rPr>
+          <w:rFonts w:asciiTheme="minorHAnsi" w:hAnsiTheme="minorHAnsi"/>
+          <w:sz w:val="20"/>
+          <w:szCs w:val="20"/>
+        </w:rPr>
+        <w:t>Gauhati High Court cause lists show who appears for the government, usually as a standing counsel code in the advocate column (for example, “SC, EDU” or “PP, ASSAM”). Each code is mapped to its department in the administration module. The system scores every case for every department using the following signals:</w:t>
+      </w:r>
+    </w:p>
+    <w:p>
+      <w:pPr>
+        <w:pStyle w:val="ListParagraph"/>
+        <w:numPr>
+          <w:ilvl w:val="0"/>
+          <w:numId w:val="2"/>
+        </w:numPr>
+        <w:spacing w:after="70" w:line="270" w:lineRule="auto"/>
+        <w:jc w:val="both"/>
+        <w:rPr>
+          <w:rFonts w:asciiTheme="minorHAnsi" w:hAnsiTheme="minorHAnsi"/>
+          <w:sz w:val="20"/>
+          <w:szCs w:val="20"/>
+        </w:rPr>
+      </w:pPr>
+      <w:r>
+        <w:rPr>
+          <w:rFonts w:asciiTheme="minorHAnsi" w:hAnsiTheme="minorHAnsi"/>
+          <w:b/>
+          <w:bCs/>
+          <w:sz w:val="20"/>
+          <w:szCs w:val="20"/>
+        </w:rPr>
+        <w:t xml:space="preserve">Standing counsel code: </w:t>
+      </w:r>
+      <w:r>
+        <w:rPr>
+          <w:rFonts w:asciiTheme="minorHAnsi" w:hAnsiTheme="minorHAnsi"/>
+          <w:sz w:val="20"/>
+          <w:szCs w:val="20"/>
+        </w:rPr>
+        <w:t>a mapped code in the cause list entry. This is the strongest signal.</w:t>
+      </w:r>
+    </w:p>
+    <w:p>
+      <w:pPr>
+        <w:pStyle w:val="ListParagraph"/>
+        <w:numPr>
+          <w:ilvl w:val="0"/>
+          <w:numId w:val="2"/>
+        </w:numPr>
+        <w:spacing w:after="70" w:line="270" w:lineRule="auto"/>
+        <w:jc w:val="both"/>
+        <w:rPr>
+          <w:rFonts w:asciiTheme="minorHAnsi" w:hAnsiTheme="minorHAnsi"/>
+          <w:sz w:val="20"/>
+          <w:szCs w:val="20"/>
+        </w:rPr>
+      </w:pPr>
+      <w:r>
+        <w:rPr>
+          <w:rFonts w:asciiTheme="minorHAnsi" w:hAnsiTheme="minorHAnsi"/>
+          <w:b/>
+          <w:bCs/>
+          <w:sz w:val="20"/>
+          <w:szCs w:val="20"/>
+        </w:rPr>
+        <w:t xml:space="preserve">Keywords and name patterns: </w:t>
+      </w:r>
+      <w:r>
+        <w:rPr>
+          <w:rFonts w:asciiTheme="minorHAnsi" w:hAnsiTheme="minorHAnsi"/>
+          <w:sz w:val="20"/>
+          <w:szCs w:val="20"/>
+        </w:rPr>
+        <w:t>department names and designations appearing in the party names (for example, “Director of Secondary Education”).</w:t>
+      </w:r>
+    </w:p>
+    <w:p>
+      <w:pPr>
+        <w:pStyle w:val="ListParagraph"/>
+        <w:numPr>
+          <w:ilvl w:val="0"/>
+          <w:numId w:val="2"/>
+        </w:numPr>
+        <w:spacing w:after="70" w:line="270" w:lineRule="auto"/>
+        <w:jc w:val="both"/>
+        <w:rPr>
+          <w:rFonts w:asciiTheme="minorHAnsi" w:hAnsiTheme="minorHAnsi"/>
+          <w:sz w:val="20"/>
+          <w:szCs w:val="20"/>
+        </w:rPr>
+      </w:pPr>
+      <w:r>
+        <w:rPr>
+          <w:rFonts w:asciiTheme="minorHAnsi" w:hAnsiTheme="minorHAnsi"/>
+          <w:b/>
+          <w:bCs/>
+          <w:sz w:val="20"/>
+          <w:szCs w:val="20"/>
+        </w:rPr>
+        <w:t xml:space="preserve">Linked-case history: </w:t>
+      </w:r>
+      <w:r>
+        <w:rPr>
+          <w:rFonts w:asciiTheme="minorHAnsi" w:hAnsiTheme="minorHAnsi"/>
+          <w:sz w:val="20"/>
+          <w:szCs w:val="20"/>
+        </w:rPr>
+        <w:t>if a related case, such as the original case behind an appeal, has already been claimed by a department, the new case leans toward that department.</w:t>
+      </w:r>
+    </w:p>
+    <w:p>
+      <w:pPr>
+        <w:pStyle w:val="ListParagraph"/>
+        <w:numPr>
+          <w:ilvl w:val="0"/>
+          <w:numId w:val="2"/>
+        </w:numPr>
+        <w:spacing w:after="70" w:line="270" w:lineRule="auto"/>
+        <w:jc w:val="both"/>
+        <w:rPr>
+          <w:rFonts w:asciiTheme="minorHAnsi" w:hAnsiTheme="minorHAnsi"/>
+          <w:sz w:val="20"/>
+          <w:szCs w:val="20"/>
+        </w:rPr>
+      </w:pPr>
+      <w:r>
+        <w:rPr>
+          <w:rFonts w:asciiTheme="minorHAnsi" w:hAnsiTheme="minorHAnsi"/>
+          <w:b/>
+          <w:bCs/>
+          <w:sz w:val="20"/>
+          <w:szCs w:val="20"/>
+        </w:rPr>
+        <w:t xml:space="preserve">Watchlist: </w:t>
+      </w:r>
+      <w:r>
+        <w:rPr>
+          <w:rFonts w:asciiTheme="minorHAnsi" w:hAnsiTheme="minorHAnsi"/>
+          <w:sz w:val="20"/>
+          <w:szCs w:val="20"/>
+        </w:rPr>
+        <w:t>specific cases a department has asked to follow.</w:t>
+      </w:r>
+    </w:p>
+    <w:p>
+      <w:pPr>
+        <w:pStyle w:val="Heading2"/>
+        <w:jc w:val="both"/>
+        <w:rPr>
+          <w:rFonts w:asciiTheme="minorHAnsi" w:hAnsiTheme="minorHAnsi"/>
+          <w:sz w:val="20"/>
+          <w:szCs w:val="20"/>
+        </w:rPr>
+      </w:pPr>
+      <w:r>
+        <w:rPr>
+          <w:rFonts w:asciiTheme="minorHAnsi" w:hAnsiTheme="minorHAnsi"/>
+          <w:sz w:val="20"/>
+          <w:szCs w:val="20"/>
+        </w:rPr>
+        <w:lastRenderedPageBreak/>
+        <w:t>4.2 Probability score and recommendations</w:t>
+      </w:r>
+    </w:p>
+    <w:p>
+      <w:pPr>
+        <w:spacing w:after="120" w:line="276" w:lineRule="auto"/>
+        <w:jc w:val="both"/>
+        <w:rPr>
+          <w:rFonts w:asciiTheme="minorHAnsi" w:hAnsiTheme="minorHAnsi"/>
+          <w:sz w:val="20"/>
+          <w:szCs w:val="20"/>
+        </w:rPr>
+      </w:pPr>
+      <w:r>
+        <w:rPr>
+          <w:rFonts w:asciiTheme="minorHAnsi" w:hAnsiTheme="minorHAnsi"/>
+          <w:sz w:val="20"/>
+          <w:szCs w:val="20"/>
+        </w:rPr>
+        <w:t>The signals are combined into a score between 0 and 1 for each department, and the score decides how prominently the case is recommended to each department, as shown in Figure 3 and Table 6. In every case, the department decides by claiming it.</w:t>
+      </w:r>
+    </w:p>
+    <w:p>
+      <w:pPr>
+        <w:spacing w:before="120" w:after="60"/>
+        <w:jc w:val="both"/>
+        <w:rPr>
+          <w:rFonts w:asciiTheme="minorHAnsi" w:hAnsiTheme="minorHAnsi"/>
+          <w:sz w:val="20"/>
+          <w:szCs w:val="20"/>
+        </w:rPr>
+      </w:pPr>
+      <w:r>
+        <w:rPr>
+          <w:rFonts w:asciiTheme="minorHAnsi" w:hAnsiTheme="minorHAnsi"/>
+          <w:noProof/>
+          <w:sz w:val="20"/>
+          <w:szCs w:val="20"/>
+        </w:rPr>
+        <w:drawing>
+          <wp:inline distT="0" distB="0" distL="0" distR="0" wp14:anchorId="31DAD869" wp14:editId="33AD01B2">
+            <wp:extent cx="5524500" cy="3695700"/>
+            <wp:effectExtent l="0" t="0" r="0" b="0"/>
+            <wp:docPr id="2020312856" name="Picture 2020312856"/>
+            <wp:cNvGraphicFramePr>
+              <a:graphicFrameLocks xmlns:a="http://schemas.openxmlformats.org/drawingml/2006/main" noChangeAspect="1"/>
+            </wp:cNvGraphicFramePr>
+            <a:graphic xmlns:a="http://schemas.openxmlformats.org/drawingml/2006/main">
+              <a:graphicData uri="http://schemas.openxmlformats.org/drawingml/2006/picture">
+                <pic:pic xmlns:pic="http://schemas.openxmlformats.org/drawingml/2006/picture">
+                  <pic:nvPicPr>
+                    <pic:cNvPr id="0" name=""/>
+                    <pic:cNvPicPr>
+                      <a:picLocks noChangeAspect="1" noChangeArrowheads="1"/>
+                    </pic:cNvPicPr>
+                  </pic:nvPicPr>
+                  <pic:blipFill>
+                    <a:blip r:embed="rId10"/>
+                    <a:srcRect/>
+                    <a:stretch>
+                      <a:fillRect/>
+                    </a:stretch>
+                  </pic:blipFill>
+                  <pic:spPr bwMode="auto">
+                    <a:xfrm>
+                      <a:off x="0" y="0"/>
                       <a:ext cx="5524500" cy="3695700"/>
                     </a:xfrm>
                     <a:prstGeom prst="rect">
@@ -5829,7 +5595,7 @@
     <w:p>
       <w:pPr>
         <w:spacing w:before="60" w:after="240"/>
-        <w:jc w:val="both"/>
+        <w:jc w:val="center"/>
         <w:rPr>
           <w:rFonts w:asciiTheme="minorHAnsi" w:hAnsiTheme="minorHAnsi"/>
           <w:sz w:val="20"/>
@@ -5870,12 +5636,6 @@
         <w:gridCol w:w="6426"/>
       </w:tblGrid>
       <w:tr>
-        <w:tblPrEx>
-          <w:tblCellMar>
-            <w:top w:w="0" w:type="dxa"/>
-            <w:bottom w:w="0" w:type="dxa"/>
-          </w:tblCellMar>
-        </w:tblPrEx>
         <w:trPr>
           <w:cantSplit/>
           <w:tblHeader/>
@@ -5960,12 +5720,6 @@
         </w:tc>
       </w:tr>
       <w:tr>
-        <w:tblPrEx>
-          <w:tblCellMar>
-            <w:top w:w="0" w:type="dxa"/>
-            <w:bottom w:w="0" w:type="dxa"/>
-          </w:tblCellMar>
-        </w:tblPrEx>
         <w:trPr>
           <w:cantSplit/>
         </w:trPr>
@@ -6035,18 +5789,28 @@
                 <w:sz w:val="20"/>
                 <w:szCs w:val="20"/>
               </w:rPr>
-              <w:t>Shown at the top of the department's inbox as a strong recommendation. The department claims it, or dismisses it if it is not theirs.</w:t>
+              <w:t xml:space="preserve">Shown at the top of the department's inbox as a strong recommendation. The department claims </w:t>
+            </w:r>
+            <w:r>
+              <w:rPr>
+                <w:rFonts w:asciiTheme="minorHAnsi" w:hAnsiTheme="minorHAnsi"/>
+                <w:sz w:val="20"/>
+                <w:szCs w:val="20"/>
+              </w:rPr>
+              <w:t>it or</w:t>
+            </w:r>
+            <w:r>
+              <w:rPr>
+                <w:rFonts w:asciiTheme="minorHAnsi" w:hAnsiTheme="minorHAnsi"/>
+                <w:sz w:val="20"/>
+                <w:szCs w:val="20"/>
+              </w:rPr>
+              <w:t xml:space="preserve"> dismisses it if it is not theirs.</w:t>
             </w:r>
           </w:p>
         </w:tc>
       </w:tr>
       <w:tr>
-        <w:tblPrEx>
-          <w:tblCellMar>
-            <w:top w:w="0" w:type="dxa"/>
-            <w:bottom w:w="0" w:type="dxa"/>
-          </w:tblCellMar>
-        </w:tblPrEx>
         <w:trPr>
           <w:cantSplit/>
         </w:trPr>
@@ -6122,12 +5886,6 @@
         </w:tc>
       </w:tr>
       <w:tr>
-        <w:tblPrEx>
-          <w:tblCellMar>
-            <w:top w:w="0" w:type="dxa"/>
-            <w:bottom w:w="0" w:type="dxa"/>
-          </w:tblCellMar>
-        </w:tblPrEx>
         <w:trPr>
           <w:cantSplit/>
         </w:trPr>
@@ -6436,12 +6194,6 @@
         <w:gridCol w:w="6826"/>
       </w:tblGrid>
       <w:tr>
-        <w:tblPrEx>
-          <w:tblCellMar>
-            <w:top w:w="0" w:type="dxa"/>
-            <w:bottom w:w="0" w:type="dxa"/>
-          </w:tblCellMar>
-        </w:tblPrEx>
         <w:trPr>
           <w:cantSplit/>
           <w:tblHeader/>
@@ -6526,12 +6278,6 @@
         </w:tc>
       </w:tr>
       <w:tr>
-        <w:tblPrEx>
-          <w:tblCellMar>
-            <w:top w:w="0" w:type="dxa"/>
-            <w:bottom w:w="0" w:type="dxa"/>
-          </w:tblCellMar>
-        </w:tblPrEx>
         <w:trPr>
           <w:cantSplit/>
         </w:trPr>
@@ -6607,12 +6353,6 @@
         </w:tc>
       </w:tr>
       <w:tr>
-        <w:tblPrEx>
-          <w:tblCellMar>
-            <w:top w:w="0" w:type="dxa"/>
-            <w:bottom w:w="0" w:type="dxa"/>
-          </w:tblCellMar>
-        </w:tblPrEx>
         <w:trPr>
           <w:cantSplit/>
         </w:trPr>
@@ -6868,12 +6608,6 @@
         <w:gridCol w:w="6826"/>
       </w:tblGrid>
       <w:tr>
-        <w:tblPrEx>
-          <w:tblCellMar>
-            <w:top w:w="0" w:type="dxa"/>
-            <w:bottom w:w="0" w:type="dxa"/>
-          </w:tblCellMar>
-        </w:tblPrEx>
         <w:trPr>
           <w:cantSplit/>
           <w:tblHeader/>
@@ -6958,12 +6692,6 @@
         </w:tc>
       </w:tr>
       <w:tr>
-        <w:tblPrEx>
-          <w:tblCellMar>
-            <w:top w:w="0" w:type="dxa"/>
-            <w:bottom w:w="0" w:type="dxa"/>
-          </w:tblCellMar>
-        </w:tblPrEx>
         <w:trPr>
           <w:cantSplit/>
         </w:trPr>
@@ -7039,12 +6767,6 @@
         </w:tc>
       </w:tr>
       <w:tr>
-        <w:tblPrEx>
-          <w:tblCellMar>
-            <w:top w:w="0" w:type="dxa"/>
-            <w:bottom w:w="0" w:type="dxa"/>
-          </w:tblCellMar>
-        </w:tblPrEx>
         <w:trPr>
           <w:cantSplit/>
         </w:trPr>
@@ -7356,12 +7078,6 @@
         <w:gridCol w:w="6826"/>
       </w:tblGrid>
       <w:tr>
-        <w:tblPrEx>
-          <w:tblCellMar>
-            <w:top w:w="0" w:type="dxa"/>
-            <w:bottom w:w="0" w:type="dxa"/>
-          </w:tblCellMar>
-        </w:tblPrEx>
         <w:trPr>
           <w:cantSplit/>
           <w:tblHeader/>
@@ -7447,12 +7163,6 @@
         </w:tc>
       </w:tr>
       <w:tr>
-        <w:tblPrEx>
-          <w:tblCellMar>
-            <w:top w:w="0" w:type="dxa"/>
-            <w:bottom w:w="0" w:type="dxa"/>
-          </w:tblCellMar>
-        </w:tblPrEx>
         <w:trPr>
           <w:cantSplit/>
         </w:trPr>
@@ -7528,12 +7238,6 @@
         </w:tc>
       </w:tr>
       <w:tr>
-        <w:tblPrEx>
-          <w:tblCellMar>
-            <w:top w:w="0" w:type="dxa"/>
-            <w:bottom w:w="0" w:type="dxa"/>
-          </w:tblCellMar>
-        </w:tblPrEx>
         <w:trPr>
           <w:cantSplit/>
         </w:trPr>
@@ -7813,12 +7517,6 @@
         <w:gridCol w:w="6826"/>
       </w:tblGrid>
       <w:tr>
-        <w:tblPrEx>
-          <w:tblCellMar>
-            <w:top w:w="0" w:type="dxa"/>
-            <w:bottom w:w="0" w:type="dxa"/>
-          </w:tblCellMar>
-        </w:tblPrEx>
         <w:trPr>
           <w:cantSplit/>
           <w:tblHeader/>
@@ -7903,12 +7601,6 @@
         </w:tc>
       </w:tr>
       <w:tr>
-        <w:tblPrEx>
-          <w:tblCellMar>
-            <w:top w:w="0" w:type="dxa"/>
-            <w:bottom w:w="0" w:type="dxa"/>
-          </w:tblCellMar>
-        </w:tblPrEx>
         <w:trPr>
           <w:cantSplit/>
         </w:trPr>
@@ -7984,12 +7676,6 @@
         </w:tc>
       </w:tr>
       <w:tr>
-        <w:tblPrEx>
-          <w:tblCellMar>
-            <w:top w:w="0" w:type="dxa"/>
-            <w:bottom w:w="0" w:type="dxa"/>
-          </w:tblCellMar>
-        </w:tblPrEx>
         <w:trPr>
           <w:cantSplit/>
         </w:trPr>
@@ -8229,12 +7915,6 @@
         <w:gridCol w:w="6826"/>
       </w:tblGrid>
       <w:tr>
-        <w:tblPrEx>
-          <w:tblCellMar>
-            <w:top w:w="0" w:type="dxa"/>
-            <w:bottom w:w="0" w:type="dxa"/>
-          </w:tblCellMar>
-        </w:tblPrEx>
         <w:trPr>
           <w:cantSplit/>
           <w:tblHeader/>
@@ -8319,12 +7999,6 @@
         </w:tc>
       </w:tr>
       <w:tr>
-        <w:tblPrEx>
-          <w:tblCellMar>
-            <w:top w:w="0" w:type="dxa"/>
-            <w:bottom w:w="0" w:type="dxa"/>
-          </w:tblCellMar>
-        </w:tblPrEx>
         <w:trPr>
           <w:cantSplit/>
         </w:trPr>
@@ -8400,12 +8074,6 @@
         </w:tc>
       </w:tr>
       <w:tr>
-        <w:tblPrEx>
-          <w:tblCellMar>
-            <w:top w:w="0" w:type="dxa"/>
-            <w:bottom w:w="0" w:type="dxa"/>
-          </w:tblCellMar>
-        </w:tblPrEx>
         <w:trPr>
           <w:cantSplit/>
         </w:trPr>
@@ -8742,12 +8410,6 @@
         <w:gridCol w:w="6826"/>
       </w:tblGrid>
       <w:tr>
-        <w:tblPrEx>
-          <w:tblCellMar>
-            <w:top w:w="0" w:type="dxa"/>
-            <w:bottom w:w="0" w:type="dxa"/>
-          </w:tblCellMar>
-        </w:tblPrEx>
         <w:trPr>
           <w:cantSplit/>
           <w:tblHeader/>
@@ -8832,12 +8494,6 @@
         </w:tc>
       </w:tr>
       <w:tr>
-        <w:tblPrEx>
-          <w:tblCellMar>
-            <w:top w:w="0" w:type="dxa"/>
-            <w:bottom w:w="0" w:type="dxa"/>
-          </w:tblCellMar>
-        </w:tblPrEx>
         <w:trPr>
           <w:cantSplit/>
         </w:trPr>
@@ -8913,12 +8569,6 @@
         </w:tc>
       </w:tr>
       <w:tr>
-        <w:tblPrEx>
-          <w:tblCellMar>
-            <w:top w:w="0" w:type="dxa"/>
-            <w:bottom w:w="0" w:type="dxa"/>
-          </w:tblCellMar>
-        </w:tblPrEx>
         <w:trPr>
           <w:cantSplit/>
         </w:trPr>
@@ -9158,12 +8808,6 @@
         <w:gridCol w:w="6826"/>
       </w:tblGrid>
       <w:tr>
-        <w:tblPrEx>
-          <w:tblCellMar>
-            <w:top w:w="0" w:type="dxa"/>
-            <w:bottom w:w="0" w:type="dxa"/>
-          </w:tblCellMar>
-        </w:tblPrEx>
         <w:trPr>
           <w:cantSplit/>
           <w:tblHeader/>
@@ -9248,12 +8892,6 @@
         </w:tc>
       </w:tr>
       <w:tr>
-        <w:tblPrEx>
-          <w:tblCellMar>
-            <w:top w:w="0" w:type="dxa"/>
-            <w:bottom w:w="0" w:type="dxa"/>
-          </w:tblCellMar>
-        </w:tblPrEx>
         <w:trPr>
           <w:cantSplit/>
         </w:trPr>
@@ -9329,12 +8967,6 @@
         </w:tc>
       </w:tr>
       <w:tr>
-        <w:tblPrEx>
-          <w:tblCellMar>
-            <w:top w:w="0" w:type="dxa"/>
-            <w:bottom w:w="0" w:type="dxa"/>
-          </w:tblCellMar>
-        </w:tblPrEx>
         <w:trPr>
           <w:cantSplit/>
         </w:trPr>
@@ -9574,12 +9206,6 @@
         <w:gridCol w:w="6826"/>
       </w:tblGrid>
       <w:tr>
-        <w:tblPrEx>
-          <w:tblCellMar>
-            <w:top w:w="0" w:type="dxa"/>
-            <w:bottom w:w="0" w:type="dxa"/>
-          </w:tblCellMar>
-        </w:tblPrEx>
         <w:trPr>
           <w:cantSplit/>
           <w:tblHeader/>
@@ -9665,12 +9291,6 @@
         </w:tc>
       </w:tr>
       <w:tr>
-        <w:tblPrEx>
-          <w:tblCellMar>
-            <w:top w:w="0" w:type="dxa"/>
-            <w:bottom w:w="0" w:type="dxa"/>
-          </w:tblCellMar>
-        </w:tblPrEx>
         <w:trPr>
           <w:cantSplit/>
         </w:trPr>
@@ -9746,12 +9366,6 @@
         </w:tc>
       </w:tr>
       <w:tr>
-        <w:tblPrEx>
-          <w:tblCellMar>
-            <w:top w:w="0" w:type="dxa"/>
-            <w:bottom w:w="0" w:type="dxa"/>
-          </w:tblCellMar>
-        </w:tblPrEx>
         <w:trPr>
           <w:cantSplit/>
         </w:trPr>
@@ -10170,7 +9784,7 @@
                     </pic:cNvPicPr>
                   </pic:nvPicPr>
                   <pic:blipFill>
-                    <a:blip r:embed="rId10"/>
+                    <a:blip r:embed="rId11"/>
                     <a:srcRect/>
                     <a:stretch>
                       <a:fillRect/>
@@ -10236,12 +9850,6 @@
         <w:gridCol w:w="6826"/>
       </w:tblGrid>
       <w:tr>
-        <w:tblPrEx>
-          <w:tblCellMar>
-            <w:top w:w="0" w:type="dxa"/>
-            <w:bottom w:w="0" w:type="dxa"/>
-          </w:tblCellMar>
-        </w:tblPrEx>
         <w:trPr>
           <w:cantSplit/>
           <w:tblHeader/>
@@ -10327,12 +9935,6 @@
         </w:tc>
       </w:tr>
       <w:tr>
-        <w:tblPrEx>
-          <w:tblCellMar>
-            <w:top w:w="0" w:type="dxa"/>
-            <w:bottom w:w="0" w:type="dxa"/>
-          </w:tblCellMar>
-        </w:tblPrEx>
         <w:trPr>
           <w:cantSplit/>
         </w:trPr>
@@ -10408,12 +10010,6 @@
         </w:tc>
       </w:tr>
       <w:tr>
-        <w:tblPrEx>
-          <w:tblCellMar>
-            <w:top w:w="0" w:type="dxa"/>
-            <w:bottom w:w="0" w:type="dxa"/>
-          </w:tblCellMar>
-        </w:tblPrEx>
         <w:trPr>
           <w:cantSplit/>
         </w:trPr>
@@ -10653,12 +10249,6 @@
         <w:gridCol w:w="6826"/>
       </w:tblGrid>
       <w:tr>
-        <w:tblPrEx>
-          <w:tblCellMar>
-            <w:top w:w="0" w:type="dxa"/>
-            <w:bottom w:w="0" w:type="dxa"/>
-          </w:tblCellMar>
-        </w:tblPrEx>
         <w:trPr>
           <w:cantSplit/>
           <w:tblHeader/>
@@ -10743,12 +10333,6 @@
         </w:tc>
       </w:tr>
       <w:tr>
-        <w:tblPrEx>
-          <w:tblCellMar>
-            <w:top w:w="0" w:type="dxa"/>
-            <w:bottom w:w="0" w:type="dxa"/>
-          </w:tblCellMar>
-        </w:tblPrEx>
         <w:trPr>
           <w:cantSplit/>
         </w:trPr>
@@ -10824,12 +10408,6 @@
         </w:tc>
       </w:tr>
       <w:tr>
-        <w:tblPrEx>
-          <w:tblCellMar>
-            <w:top w:w="0" w:type="dxa"/>
-            <w:bottom w:w="0" w:type="dxa"/>
-          </w:tblCellMar>
-        </w:tblPrEx>
         <w:trPr>
           <w:cantSplit/>
         </w:trPr>
@@ -11069,12 +10647,6 @@
         <w:gridCol w:w="6826"/>
       </w:tblGrid>
       <w:tr>
-        <w:tblPrEx>
-          <w:tblCellMar>
-            <w:top w:w="0" w:type="dxa"/>
-            <w:bottom w:w="0" w:type="dxa"/>
-          </w:tblCellMar>
-        </w:tblPrEx>
         <w:trPr>
           <w:cantSplit/>
           <w:tblHeader/>
@@ -11159,12 +10731,6 @@
         </w:tc>
       </w:tr>
       <w:tr>
-        <w:tblPrEx>
-          <w:tblCellMar>
-            <w:top w:w="0" w:type="dxa"/>
-            <w:bottom w:w="0" w:type="dxa"/>
-          </w:tblCellMar>
-        </w:tblPrEx>
         <w:trPr>
           <w:cantSplit/>
         </w:trPr>
@@ -11240,12 +10806,6 @@
         </w:tc>
       </w:tr>
       <w:tr>
-        <w:tblPrEx>
-          <w:tblCellMar>
-            <w:top w:w="0" w:type="dxa"/>
-            <w:bottom w:w="0" w:type="dxa"/>
-          </w:tblCellMar>
-        </w:tblPrEx>
         <w:trPr>
           <w:cantSplit/>
         </w:trPr>
@@ -11485,12 +11045,6 @@
         <w:gridCol w:w="6826"/>
       </w:tblGrid>
       <w:tr>
-        <w:tblPrEx>
-          <w:tblCellMar>
-            <w:top w:w="0" w:type="dxa"/>
-            <w:bottom w:w="0" w:type="dxa"/>
-          </w:tblCellMar>
-        </w:tblPrEx>
         <w:trPr>
           <w:cantSplit/>
           <w:tblHeader/>
@@ -11575,12 +11129,6 @@
         </w:tc>
       </w:tr>
       <w:tr>
-        <w:tblPrEx>
-          <w:tblCellMar>
-            <w:top w:w="0" w:type="dxa"/>
-            <w:bottom w:w="0" w:type="dxa"/>
-          </w:tblCellMar>
-        </w:tblPrEx>
         <w:trPr>
           <w:cantSplit/>
         </w:trPr>
@@ -11656,12 +11204,6 @@
         </w:tc>
       </w:tr>
       <w:tr>
-        <w:tblPrEx>
-          <w:tblCellMar>
-            <w:top w:w="0" w:type="dxa"/>
-            <w:bottom w:w="0" w:type="dxa"/>
-          </w:tblCellMar>
-        </w:tblPrEx>
         <w:trPr>
           <w:cantSplit/>
         </w:trPr>
@@ -11878,12 +11420,6 @@
         <w:gridCol w:w="6826"/>
       </w:tblGrid>
       <w:tr>
-        <w:tblPrEx>
-          <w:tblCellMar>
-            <w:top w:w="0" w:type="dxa"/>
-            <w:bottom w:w="0" w:type="dxa"/>
-          </w:tblCellMar>
-        </w:tblPrEx>
         <w:trPr>
           <w:cantSplit/>
           <w:tblHeader/>
@@ -11968,12 +11504,6 @@
         </w:tc>
       </w:tr>
       <w:tr>
-        <w:tblPrEx>
-          <w:tblCellMar>
-            <w:top w:w="0" w:type="dxa"/>
-            <w:bottom w:w="0" w:type="dxa"/>
-          </w:tblCellMar>
-        </w:tblPrEx>
         <w:trPr>
           <w:cantSplit/>
         </w:trPr>
@@ -12049,12 +11579,6 @@
         </w:tc>
       </w:tr>
       <w:tr>
-        <w:tblPrEx>
-          <w:tblCellMar>
-            <w:top w:w="0" w:type="dxa"/>
-            <w:bottom w:w="0" w:type="dxa"/>
-          </w:tblCellMar>
-        </w:tblPrEx>
         <w:trPr>
           <w:cantSplit/>
         </w:trPr>
@@ -12183,12 +11707,6 @@
         <w:gridCol w:w="3000"/>
       </w:tblGrid>
       <w:tr>
-        <w:tblPrEx>
-          <w:tblCellMar>
-            <w:top w:w="0" w:type="dxa"/>
-            <w:bottom w:w="0" w:type="dxa"/>
-          </w:tblCellMar>
-        </w:tblPrEx>
         <w:trPr>
           <w:cantSplit/>
           <w:tblHeader/>
@@ -12312,12 +11830,6 @@
         </w:tc>
       </w:tr>
       <w:tr>
-        <w:tblPrEx>
-          <w:tblCellMar>
-            <w:top w:w="0" w:type="dxa"/>
-            <w:bottom w:w="0" w:type="dxa"/>
-          </w:tblCellMar>
-        </w:tblPrEx>
         <w:trPr>
           <w:cantSplit/>
         </w:trPr>
@@ -12428,12 +11940,6 @@
         </w:tc>
       </w:tr>
       <w:tr>
-        <w:tblPrEx>
-          <w:tblCellMar>
-            <w:top w:w="0" w:type="dxa"/>
-            <w:bottom w:w="0" w:type="dxa"/>
-          </w:tblCellMar>
-        </w:tblPrEx>
         <w:trPr>
           <w:cantSplit/>
         </w:trPr>
@@ -12544,12 +12050,6 @@
         </w:tc>
       </w:tr>
       <w:tr>
-        <w:tblPrEx>
-          <w:tblCellMar>
-            <w:top w:w="0" w:type="dxa"/>
-            <w:bottom w:w="0" w:type="dxa"/>
-          </w:tblCellMar>
-        </w:tblPrEx>
         <w:trPr>
           <w:cantSplit/>
         </w:trPr>
@@ -12660,12 +12160,6 @@
         </w:tc>
       </w:tr>
       <w:tr>
-        <w:tblPrEx>
-          <w:tblCellMar>
-            <w:top w:w="0" w:type="dxa"/>
-            <w:bottom w:w="0" w:type="dxa"/>
-          </w:tblCellMar>
-        </w:tblPrEx>
         <w:trPr>
           <w:cantSplit/>
         </w:trPr>
@@ -12776,12 +12270,6 @@
         </w:tc>
       </w:tr>
       <w:tr>
-        <w:tblPrEx>
-          <w:tblCellMar>
-            <w:top w:w="0" w:type="dxa"/>
-            <w:bottom w:w="0" w:type="dxa"/>
-          </w:tblCellMar>
-        </w:tblPrEx>
         <w:trPr>
           <w:cantSplit/>
         </w:trPr>
@@ -12892,12 +12380,6 @@
         </w:tc>
       </w:tr>
       <w:tr>
-        <w:tblPrEx>
-          <w:tblCellMar>
-            <w:top w:w="0" w:type="dxa"/>
-            <w:bottom w:w="0" w:type="dxa"/>
-          </w:tblCellMar>
-        </w:tblPrEx>
         <w:trPr>
           <w:cantSplit/>
         </w:trPr>
@@ -13008,12 +12490,6 @@
         </w:tc>
       </w:tr>
       <w:tr>
-        <w:tblPrEx>
-          <w:tblCellMar>
-            <w:top w:w="0" w:type="dxa"/>
-            <w:bottom w:w="0" w:type="dxa"/>
-          </w:tblCellMar>
-        </w:tblPrEx>
         <w:trPr>
           <w:cantSplit/>
         </w:trPr>
@@ -13124,12 +12600,6 @@
         </w:tc>
       </w:tr>
       <w:tr>
-        <w:tblPrEx>
-          <w:tblCellMar>
-            <w:top w:w="0" w:type="dxa"/>
-            <w:bottom w:w="0" w:type="dxa"/>
-          </w:tblCellMar>
-        </w:tblPrEx>
         <w:trPr>
           <w:cantSplit/>
         </w:trPr>
@@ -13240,12 +12710,6 @@
         </w:tc>
       </w:tr>
       <w:tr>
-        <w:tblPrEx>
-          <w:tblCellMar>
-            <w:top w:w="0" w:type="dxa"/>
-            <w:bottom w:w="0" w:type="dxa"/>
-          </w:tblCellMar>
-        </w:tblPrEx>
         <w:trPr>
           <w:cantSplit/>
         </w:trPr>
@@ -13356,12 +12820,6 @@
         </w:tc>
       </w:tr>
       <w:tr>
-        <w:tblPrEx>
-          <w:tblCellMar>
-            <w:top w:w="0" w:type="dxa"/>
-            <w:bottom w:w="0" w:type="dxa"/>
-          </w:tblCellMar>
-        </w:tblPrEx>
         <w:trPr>
           <w:cantSplit/>
         </w:trPr>
@@ -13472,12 +12930,6 @@
         </w:tc>
       </w:tr>
       <w:tr>
-        <w:tblPrEx>
-          <w:tblCellMar>
-            <w:top w:w="0" w:type="dxa"/>
-            <w:bottom w:w="0" w:type="dxa"/>
-          </w:tblCellMar>
-        </w:tblPrEx>
         <w:trPr>
           <w:cantSplit/>
         </w:trPr>
@@ -13588,12 +13040,6 @@
         </w:tc>
       </w:tr>
       <w:tr>
-        <w:tblPrEx>
-          <w:tblCellMar>
-            <w:top w:w="0" w:type="dxa"/>
-            <w:bottom w:w="0" w:type="dxa"/>
-          </w:tblCellMar>
-        </w:tblPrEx>
         <w:trPr>
           <w:cantSplit/>
         </w:trPr>
@@ -13704,12 +13150,6 @@
         </w:tc>
       </w:tr>
       <w:tr>
-        <w:tblPrEx>
-          <w:tblCellMar>
-            <w:top w:w="0" w:type="dxa"/>
-            <w:bottom w:w="0" w:type="dxa"/>
-          </w:tblCellMar>
-        </w:tblPrEx>
         <w:trPr>
           <w:cantSplit/>
         </w:trPr>
@@ -13922,123 +13362,6 @@
             <wp:extent cx="5619750" cy="2009775"/>
             <wp:effectExtent l="0" t="0" r="0" b="0"/>
             <wp:docPr id="2017009350" name="Picture 2017009350"/>
-            <wp:cNvGraphicFramePr>
-              <a:graphicFrameLocks xmlns:a="http://schemas.openxmlformats.org/drawingml/2006/main" noChangeAspect="1"/>
-            </wp:cNvGraphicFramePr>
-            <a:graphic xmlns:a="http://schemas.openxmlformats.org/drawingml/2006/main">
-              <a:graphicData uri="http://schemas.openxmlformats.org/drawingml/2006/picture">
-                <pic:pic xmlns:pic="http://schemas.openxmlformats.org/drawingml/2006/picture">
-                  <pic:nvPicPr>
-                    <pic:cNvPr id="0" name=""/>
-                    <pic:cNvPicPr>
-                      <a:picLocks noChangeAspect="1" noChangeArrowheads="1"/>
-                    </pic:cNvPicPr>
-                  </pic:nvPicPr>
-                  <pic:blipFill>
-                    <a:blip r:embed="rId11"/>
-                    <a:srcRect/>
-                    <a:stretch>
-                      <a:fillRect/>
-                    </a:stretch>
-                  </pic:blipFill>
-                  <pic:spPr bwMode="auto">
-                    <a:xfrm>
-                      <a:off x="0" y="0"/>
-                      <a:ext cx="5619750" cy="2009775"/>
-                    </a:xfrm>
-                    <a:prstGeom prst="rect">
-                      <a:avLst/>
-                    </a:prstGeom>
-                  </pic:spPr>
-                </pic:pic>
-              </a:graphicData>
-            </a:graphic>
-          </wp:inline>
-        </w:drawing>
-      </w:r>
-    </w:p>
-    <w:p>
-      <w:pPr>
-        <w:spacing w:before="60" w:after="240"/>
-        <w:jc w:val="center"/>
-        <w:rPr>
-          <w:rFonts w:asciiTheme="minorHAnsi" w:hAnsiTheme="minorHAnsi"/>
-          <w:sz w:val="20"/>
-          <w:szCs w:val="20"/>
-        </w:rPr>
-      </w:pPr>
-      <w:r>
-        <w:rPr>
-          <w:rFonts w:asciiTheme="minorHAnsi" w:hAnsiTheme="minorHAnsi"/>
-          <w:i/>
-          <w:iCs/>
-          <w:color w:val="555555"/>
-          <w:sz w:val="20"/>
-          <w:szCs w:val="20"/>
-        </w:rPr>
-        <w:t>Figure 5: Daily data cycle</w:t>
-      </w:r>
-    </w:p>
-    <w:p>
-      <w:pPr>
-        <w:pStyle w:val="Heading2"/>
-        <w:jc w:val="both"/>
-        <w:rPr>
-          <w:rFonts w:asciiTheme="minorHAnsi" w:hAnsiTheme="minorHAnsi"/>
-          <w:sz w:val="20"/>
-          <w:szCs w:val="20"/>
-        </w:rPr>
-      </w:pPr>
-      <w:r>
-        <w:rPr>
-          <w:rFonts w:asciiTheme="minorHAnsi" w:hAnsiTheme="minorHAnsi"/>
-          <w:sz w:val="20"/>
-          <w:szCs w:val="20"/>
-        </w:rPr>
-        <w:t>6.2 From court order to alert</w:t>
-      </w:r>
-    </w:p>
-    <w:p>
-      <w:pPr>
-        <w:spacing w:after="120" w:line="276" w:lineRule="auto"/>
-        <w:jc w:val="both"/>
-        <w:rPr>
-          <w:rFonts w:asciiTheme="minorHAnsi" w:hAnsiTheme="minorHAnsi"/>
-          <w:sz w:val="20"/>
-          <w:szCs w:val="20"/>
-        </w:rPr>
-      </w:pPr>
-      <w:r>
-        <w:rPr>
-          <w:rFonts w:asciiTheme="minorHAnsi" w:hAnsiTheme="minorHAnsi"/>
-          <w:sz w:val="20"/>
-          <w:szCs w:val="20"/>
-        </w:rPr>
-        <w:t>When a new order appears for a tracked case, it is downloaded, its text is extracted, and the next-date direction is identified. The resulting date feeds the alerts calendar.</w:t>
-      </w:r>
-    </w:p>
-    <w:p>
-      <w:pPr>
-        <w:spacing w:before="120" w:after="60"/>
-        <w:jc w:val="both"/>
-        <w:rPr>
-          <w:rFonts w:asciiTheme="minorHAnsi" w:hAnsiTheme="minorHAnsi"/>
-          <w:sz w:val="20"/>
-          <w:szCs w:val="20"/>
-        </w:rPr>
-      </w:pPr>
-      <w:r>
-        <w:rPr>
-          <w:rFonts w:asciiTheme="minorHAnsi" w:hAnsiTheme="minorHAnsi"/>
-          <w:noProof/>
-          <w:sz w:val="20"/>
-          <w:szCs w:val="20"/>
-        </w:rPr>
-        <w:drawing>
-          <wp:inline distT="0" distB="0" distL="0" distR="0" wp14:anchorId="669C1AA5" wp14:editId="0DB70C87">
-            <wp:extent cx="5524500" cy="2619375"/>
-            <wp:effectExtent l="0" t="0" r="0" b="0"/>
-            <wp:docPr id="1329098809" name="Picture 1329098809"/>
             <wp:cNvGraphicFramePr>
               <a:graphicFrameLocks xmlns:a="http://schemas.openxmlformats.org/drawingml/2006/main" noChangeAspect="1"/>
             </wp:cNvGraphicFramePr>
@@ -14061,7 +13384,7 @@
                   <pic:spPr bwMode="auto">
                     <a:xfrm>
                       <a:off x="0" y="0"/>
-                      <a:ext cx="5524500" cy="2619375"/>
+                      <a:ext cx="5619750" cy="2009775"/>
                     </a:xfrm>
                     <a:prstGeom prst="rect">
                       <a:avLst/>
@@ -14093,7 +13416,7 @@
           <w:sz w:val="20"/>
           <w:szCs w:val="20"/>
         </w:rPr>
-        <w:t>Figure 6: From court order to alert</w:t>
+        <w:t>Figure 5: Daily data cycle</w:t>
       </w:r>
     </w:p>
     <w:p>
@@ -14112,7 +13435,7 @@
           <w:sz w:val="20"/>
           <w:szCs w:val="20"/>
         </w:rPr>
-        <w:t>6.3 Searching for a case</w:t>
+        <w:t>6.2 From court order to alert</w:t>
       </w:r>
     </w:p>
     <w:p>
@@ -14131,7 +13454,7 @@
           <w:sz w:val="20"/>
           <w:szCs w:val="20"/>
         </w:rPr>
-        <w:t>Search uses the portal's own database first, and reaches the court APIs only when a case is not yet held. A case found through live search is stored, so the next search finds it locally.</w:t>
+        <w:t>When a new order appears for a tracked case, it is downloaded, its text is extracted, and the next-date direction is identified. The resulting date feeds the alerts calendar.</w:t>
       </w:r>
     </w:p>
     <w:p>
@@ -14152,10 +13475,10 @@
           <w:szCs w:val="20"/>
         </w:rPr>
         <w:drawing>
-          <wp:inline distT="0" distB="0" distL="0" distR="0" wp14:anchorId="42684FB0" wp14:editId="36C5F911">
-            <wp:extent cx="5524500" cy="2171700"/>
+          <wp:inline distT="0" distB="0" distL="0" distR="0" wp14:anchorId="669C1AA5" wp14:editId="0DB70C87">
+            <wp:extent cx="5524500" cy="2619375"/>
             <wp:effectExtent l="0" t="0" r="0" b="0"/>
-            <wp:docPr id="127905355" name="Picture 127905355"/>
+            <wp:docPr id="1329098809" name="Picture 1329098809"/>
             <wp:cNvGraphicFramePr>
               <a:graphicFrameLocks xmlns:a="http://schemas.openxmlformats.org/drawingml/2006/main" noChangeAspect="1"/>
             </wp:cNvGraphicFramePr>
@@ -14178,6 +13501,123 @@
                   <pic:spPr bwMode="auto">
                     <a:xfrm>
                       <a:off x="0" y="0"/>
+                      <a:ext cx="5524500" cy="2619375"/>
+                    </a:xfrm>
+                    <a:prstGeom prst="rect">
+                      <a:avLst/>
+                    </a:prstGeom>
+                  </pic:spPr>
+                </pic:pic>
+              </a:graphicData>
+            </a:graphic>
+          </wp:inline>
+        </w:drawing>
+      </w:r>
+    </w:p>
+    <w:p>
+      <w:pPr>
+        <w:spacing w:before="60" w:after="240"/>
+        <w:jc w:val="center"/>
+        <w:rPr>
+          <w:rFonts w:asciiTheme="minorHAnsi" w:hAnsiTheme="minorHAnsi"/>
+          <w:sz w:val="20"/>
+          <w:szCs w:val="20"/>
+        </w:rPr>
+      </w:pPr>
+      <w:r>
+        <w:rPr>
+          <w:rFonts w:asciiTheme="minorHAnsi" w:hAnsiTheme="minorHAnsi"/>
+          <w:i/>
+          <w:iCs/>
+          <w:color w:val="555555"/>
+          <w:sz w:val="20"/>
+          <w:szCs w:val="20"/>
+        </w:rPr>
+        <w:t>Figure 6: From court order to alert</w:t>
+      </w:r>
+    </w:p>
+    <w:p>
+      <w:pPr>
+        <w:pStyle w:val="Heading2"/>
+        <w:jc w:val="both"/>
+        <w:rPr>
+          <w:rFonts w:asciiTheme="minorHAnsi" w:hAnsiTheme="minorHAnsi"/>
+          <w:sz w:val="20"/>
+          <w:szCs w:val="20"/>
+        </w:rPr>
+      </w:pPr>
+      <w:r>
+        <w:rPr>
+          <w:rFonts w:asciiTheme="minorHAnsi" w:hAnsiTheme="minorHAnsi"/>
+          <w:sz w:val="20"/>
+          <w:szCs w:val="20"/>
+        </w:rPr>
+        <w:t>6.3 Searching for a case</w:t>
+      </w:r>
+    </w:p>
+    <w:p>
+      <w:pPr>
+        <w:spacing w:after="120" w:line="276" w:lineRule="auto"/>
+        <w:jc w:val="both"/>
+        <w:rPr>
+          <w:rFonts w:asciiTheme="minorHAnsi" w:hAnsiTheme="minorHAnsi"/>
+          <w:sz w:val="20"/>
+          <w:szCs w:val="20"/>
+        </w:rPr>
+      </w:pPr>
+      <w:r>
+        <w:rPr>
+          <w:rFonts w:asciiTheme="minorHAnsi" w:hAnsiTheme="minorHAnsi"/>
+          <w:sz w:val="20"/>
+          <w:szCs w:val="20"/>
+        </w:rPr>
+        <w:t>Search uses the portal's own database first, and reaches the court APIs only when a case is not yet held. A case found through live search is stored, so the next search finds it locally.</w:t>
+      </w:r>
+    </w:p>
+    <w:p>
+      <w:pPr>
+        <w:spacing w:before="120" w:after="60"/>
+        <w:jc w:val="both"/>
+        <w:rPr>
+          <w:rFonts w:asciiTheme="minorHAnsi" w:hAnsiTheme="minorHAnsi"/>
+          <w:sz w:val="20"/>
+          <w:szCs w:val="20"/>
+        </w:rPr>
+      </w:pPr>
+      <w:r>
+        <w:rPr>
+          <w:rFonts w:asciiTheme="minorHAnsi" w:hAnsiTheme="minorHAnsi"/>
+          <w:noProof/>
+          <w:sz w:val="20"/>
+          <w:szCs w:val="20"/>
+        </w:rPr>
+        <w:drawing>
+          <wp:inline distT="0" distB="0" distL="0" distR="0" wp14:anchorId="42684FB0" wp14:editId="36C5F911">
+            <wp:extent cx="5524500" cy="2171700"/>
+            <wp:effectExtent l="0" t="0" r="0" b="0"/>
+            <wp:docPr id="127905355" name="Picture 127905355"/>
+            <wp:cNvGraphicFramePr>
+              <a:graphicFrameLocks xmlns:a="http://schemas.openxmlformats.org/drawingml/2006/main" noChangeAspect="1"/>
+            </wp:cNvGraphicFramePr>
+            <a:graphic xmlns:a="http://schemas.openxmlformats.org/drawingml/2006/main">
+              <a:graphicData uri="http://schemas.openxmlformats.org/drawingml/2006/picture">
+                <pic:pic xmlns:pic="http://schemas.openxmlformats.org/drawingml/2006/picture">
+                  <pic:nvPicPr>
+                    <pic:cNvPr id="0" name=""/>
+                    <pic:cNvPicPr>
+                      <a:picLocks noChangeAspect="1" noChangeArrowheads="1"/>
+                    </pic:cNvPicPr>
+                  </pic:nvPicPr>
+                  <pic:blipFill>
+                    <a:blip r:embed="rId14"/>
+                    <a:srcRect/>
+                    <a:stretch>
+                      <a:fillRect/>
+                    </a:stretch>
+                  </pic:blipFill>
+                  <pic:spPr bwMode="auto">
+                    <a:xfrm>
+                      <a:off x="0" y="0"/>
                       <a:ext cx="5524500" cy="2171700"/>
                     </a:xfrm>
                     <a:prstGeom prst="rect">
@@ -14293,12 +13733,6 @@
         <w:gridCol w:w="6426"/>
       </w:tblGrid>
       <w:tr>
-        <w:tblPrEx>
-          <w:tblCellMar>
-            <w:top w:w="0" w:type="dxa"/>
-            <w:bottom w:w="0" w:type="dxa"/>
-          </w:tblCellMar>
-        </w:tblPrEx>
         <w:trPr>
           <w:cantSplit/>
           <w:tblHeader/>
@@ -14383,12 +13817,6 @@
         </w:tc>
       </w:tr>
       <w:tr>
-        <w:tblPrEx>
-          <w:tblCellMar>
-            <w:top w:w="0" w:type="dxa"/>
-            <w:bottom w:w="0" w:type="dxa"/>
-          </w:tblCellMar>
-        </w:tblPrEx>
         <w:trPr>
           <w:cantSplit/>
         </w:trPr>
@@ -14464,12 +13892,6 @@
         </w:tc>
       </w:tr>
       <w:tr>
-        <w:tblPrEx>
-          <w:tblCellMar>
-            <w:top w:w="0" w:type="dxa"/>
-            <w:bottom w:w="0" w:type="dxa"/>
-          </w:tblCellMar>
-        </w:tblPrEx>
         <w:trPr>
           <w:cantSplit/>
         </w:trPr>
@@ -14545,12 +13967,6 @@
         </w:tc>
       </w:tr>
       <w:tr>
-        <w:tblPrEx>
-          <w:tblCellMar>
-            <w:top w:w="0" w:type="dxa"/>
-            <w:bottom w:w="0" w:type="dxa"/>
-          </w:tblCellMar>
-        </w:tblPrEx>
         <w:trPr>
           <w:cantSplit/>
         </w:trPr>
@@ -14626,12 +14042,6 @@
         </w:tc>
       </w:tr>
       <w:tr>
-        <w:tblPrEx>
-          <w:tblCellMar>
-            <w:top w:w="0" w:type="dxa"/>
-            <w:bottom w:w="0" w:type="dxa"/>
-          </w:tblCellMar>
-        </w:tblPrEx>
         <w:trPr>
           <w:cantSplit/>
         </w:trPr>
@@ -14707,12 +14117,6 @@
         </w:tc>
       </w:tr>
       <w:tr>
-        <w:tblPrEx>
-          <w:tblCellMar>
-            <w:top w:w="0" w:type="dxa"/>
-            <w:bottom w:w="0" w:type="dxa"/>
-          </w:tblCellMar>
-        </w:tblPrEx>
         <w:trPr>
           <w:cantSplit/>
         </w:trPr>
@@ -14788,12 +14192,6 @@
         </w:tc>
       </w:tr>
       <w:tr>
-        <w:tblPrEx>
-          <w:tblCellMar>
-            <w:top w:w="0" w:type="dxa"/>
-            <w:bottom w:w="0" w:type="dxa"/>
-          </w:tblCellMar>
-        </w:tblPrEx>
         <w:trPr>
           <w:cantSplit/>
         </w:trPr>
@@ -14869,12 +14267,6 @@
         </w:tc>
       </w:tr>
       <w:tr>
-        <w:tblPrEx>
-          <w:tblCellMar>
-            <w:top w:w="0" w:type="dxa"/>
-            <w:bottom w:w="0" w:type="dxa"/>
-          </w:tblCellMar>
-        </w:tblPrEx>
         <w:trPr>
           <w:cantSplit/>
         </w:trPr>
@@ -14950,12 +14342,6 @@
         </w:tc>
       </w:tr>
       <w:tr>
-        <w:tblPrEx>
-          <w:tblCellMar>
-            <w:top w:w="0" w:type="dxa"/>
-            <w:bottom w:w="0" w:type="dxa"/>
-          </w:tblCellMar>
-        </w:tblPrEx>
         <w:trPr>
           <w:cantSplit/>
         </w:trPr>
@@ -15031,12 +14417,6 @@
         </w:tc>
       </w:tr>
       <w:tr>
-        <w:tblPrEx>
-          <w:tblCellMar>
-            <w:top w:w="0" w:type="dxa"/>
-            <w:bottom w:w="0" w:type="dxa"/>
-          </w:tblCellMar>
-        </w:tblPrEx>
         <w:trPr>
           <w:cantSplit/>
         </w:trPr>
@@ -15112,12 +14492,6 @@
         </w:tc>
       </w:tr>
       <w:tr>
-        <w:tblPrEx>
-          <w:tblCellMar>
-            <w:top w:w="0" w:type="dxa"/>
-            <w:bottom w:w="0" w:type="dxa"/>
-          </w:tblCellMar>
-        </w:tblPrEx>
         <w:trPr>
           <w:cantSplit/>
         </w:trPr>
@@ -15548,12 +14922,6 @@
         <w:gridCol w:w="7326"/>
       </w:tblGrid>
       <w:tr>
-        <w:tblPrEx>
-          <w:tblCellMar>
-            <w:top w:w="0" w:type="dxa"/>
-            <w:bottom w:w="0" w:type="dxa"/>
-          </w:tblCellMar>
-        </w:tblPrEx>
         <w:trPr>
           <w:cantSplit/>
           <w:tblHeader/>
@@ -15638,12 +15006,6 @@
         </w:tc>
       </w:tr>
       <w:tr>
-        <w:tblPrEx>
-          <w:tblCellMar>
-            <w:top w:w="0" w:type="dxa"/>
-            <w:bottom w:w="0" w:type="dxa"/>
-          </w:tblCellMar>
-        </w:tblPrEx>
         <w:trPr>
           <w:cantSplit/>
         </w:trPr>
@@ -15719,12 +15081,6 @@
         </w:tc>
       </w:tr>
       <w:tr>
-        <w:tblPrEx>
-          <w:tblCellMar>
-            <w:top w:w="0" w:type="dxa"/>
-            <w:bottom w:w="0" w:type="dxa"/>
-          </w:tblCellMar>
-        </w:tblPrEx>
         <w:trPr>
           <w:cantSplit/>
         </w:trPr>
@@ -15794,18 +15150,28 @@
                 <w:sz w:val="20"/>
                 <w:szCs w:val="20"/>
               </w:rPr>
-              <w:t>Custody and workflow; case notes trail; automatic ingestion of orders and uploaded court filings into SourceTrace, including the existing orders; SourceTrace-based alerts for orders that state a period of time; SMS notifications; reports.</w:t>
+              <w:t xml:space="preserve">Custody and workflow; case notes trail; automatic ingestion of orders and uploaded court filings into SourceTrace, including the existing orders; SourceTrace-based alerts for orders that state </w:t>
+            </w:r>
+            <w:r>
+              <w:rPr>
+                <w:rFonts w:asciiTheme="minorHAnsi" w:hAnsiTheme="minorHAnsi"/>
+                <w:sz w:val="20"/>
+                <w:szCs w:val="20"/>
+              </w:rPr>
+              <w:t>a period</w:t>
+            </w:r>
+            <w:r>
+              <w:rPr>
+                <w:rFonts w:asciiTheme="minorHAnsi" w:hAnsiTheme="minorHAnsi"/>
+                <w:sz w:val="20"/>
+                <w:szCs w:val="20"/>
+              </w:rPr>
+              <w:t>; SMS notifications; reports.</w:t>
             </w:r>
           </w:p>
         </w:tc>
       </w:tr>
       <w:tr>
-        <w:tblPrEx>
-          <w:tblCellMar>
-            <w:top w:w="0" w:type="dxa"/>
-            <w:bottom w:w="0" w:type="dxa"/>
-          </w:tblCellMar>
-        </w:tblPrEx>
         <w:trPr>
           <w:cantSplit/>
         </w:trPr>
@@ -15889,7 +15255,6 @@
           <w:rFonts w:asciiTheme="minorHAnsi" w:hAnsiTheme="minorHAnsi"/>
           <w:i/>
           <w:iCs/>
-          <w:color w:val="555555"/>
           <w:sz w:val="20"/>
           <w:szCs w:val="20"/>
         </w:rPr>
@@ -15899,7 +15264,6 @@
           <w:rFonts w:asciiTheme="minorHAnsi" w:hAnsiTheme="minorHAnsi"/>
           <w:i/>
           <w:iCs/>
-          <w:color w:val="555555"/>
           <w:sz w:val="20"/>
           <w:szCs w:val="20"/>
         </w:rPr>
@@ -16015,6 +15379,7 @@
       <w:r>
         <w:rPr>
           <w:rFonts w:asciiTheme="minorHAnsi" w:hAnsiTheme="minorHAnsi"/>
+          <w:noProof/>
           <w:sz w:val="20"/>
           <w:szCs w:val="20"/>
         </w:rPr>
@@ -16036,7 +15401,7 @@
                     </pic:cNvPicPr>
                   </pic:nvPicPr>
                   <pic:blipFill>
-                    <a:blip r:embed="rId14" cstate="print">
+                    <a:blip r:embed="rId15" cstate="print">
                       <a:extLst>
                         <a:ext uri="{28A0092B-C50C-407E-A947-70E740481C1C}">
                           <a14:useLocalDpi xmlns:a14="http://schemas.microsoft.com/office/drawing/2010/main" val="0"/>
@@ -16129,23 +15494,7 @@
           <w:sz w:val="20"/>
           <w:szCs w:val="20"/>
         </w:rPr>
-        <w:t xml:space="preserve">Cases recommended to the department from the daily cause lists, with their score and the signals behind it. The department claims or dismisses each </w:t>
-      </w:r>
-      <w:r>
-        <w:rPr>
-          <w:rFonts w:asciiTheme="minorHAnsi" w:hAnsiTheme="minorHAnsi"/>
-          <w:sz w:val="20"/>
-          <w:szCs w:val="20"/>
-        </w:rPr>
-        <w:t>case or</w:t>
-      </w:r>
-      <w:r>
-        <w:rPr>
-          <w:rFonts w:asciiTheme="minorHAnsi" w:hAnsiTheme="minorHAnsi"/>
-          <w:sz w:val="20"/>
-          <w:szCs w:val="20"/>
-        </w:rPr>
-        <w:t xml:space="preserve"> suggests another department; no case is assigned automatically (Sections 4 and 5.4).</w:t>
+        <w:t>Cases recommended to the department from the daily cause lists, with their score and the signals behind it. The department claims or dismisses each case or suggests another department; no case is assigned automatically (Sections 4 and 5.4).</w:t>
       </w:r>
     </w:p>
     <w:p>
@@ -16161,6 +15510,7 @@
       <w:r>
         <w:rPr>
           <w:rFonts w:asciiTheme="minorHAnsi" w:hAnsiTheme="minorHAnsi"/>
+          <w:noProof/>
           <w:sz w:val="20"/>
           <w:szCs w:val="20"/>
         </w:rPr>
@@ -16177,135 +15527,6 @@
                 <pic:pic xmlns:pic="http://schemas.openxmlformats.org/drawingml/2006/picture">
                   <pic:nvPicPr>
                     <pic:cNvPr id="0" name="Picture 975293615"/>
-                    <pic:cNvPicPr>
-                      <a:picLocks noChangeAspect="1" noChangeArrowheads="1"/>
-                    </pic:cNvPicPr>
-                  </pic:nvPicPr>
-                  <pic:blipFill>
-                    <a:blip r:embed="rId15" cstate="print">
-                      <a:extLst>
-                        <a:ext uri="{28A0092B-C50C-407E-A947-70E740481C1C}">
-                          <a14:useLocalDpi xmlns:a14="http://schemas.microsoft.com/office/drawing/2010/main" val="0"/>
-                        </a:ext>
-                      </a:extLst>
-                    </a:blip>
-                    <a:srcRect/>
-                    <a:stretch>
-                      <a:fillRect/>
-                    </a:stretch>
-                  </pic:blipFill>
-                  <pic:spPr bwMode="auto">
-                    <a:xfrm>
-                      <a:off x="0" y="0"/>
-                      <a:ext cx="3646651" cy="2736000"/>
-                    </a:xfrm>
-                    <a:prstGeom prst="rect">
-                      <a:avLst/>
-                    </a:prstGeom>
-                    <a:noFill/>
-                    <a:ln>
-                      <a:noFill/>
-                    </a:ln>
-                  </pic:spPr>
-                </pic:pic>
-              </a:graphicData>
-            </a:graphic>
-          </wp:inline>
-        </w:drawing>
-      </w:r>
-    </w:p>
-    <w:p>
-      <w:pPr>
-        <w:spacing w:before="60" w:after="240"/>
-        <w:jc w:val="center"/>
-        <w:rPr>
-          <w:rFonts w:asciiTheme="minorHAnsi" w:hAnsiTheme="minorHAnsi"/>
-          <w:sz w:val="20"/>
-          <w:szCs w:val="20"/>
-        </w:rPr>
-      </w:pPr>
-      <w:r>
-        <w:rPr>
-          <w:rFonts w:asciiTheme="minorHAnsi" w:hAnsiTheme="minorHAnsi"/>
-          <w:i/>
-          <w:iCs/>
-          <w:sz w:val="20"/>
-          <w:szCs w:val="20"/>
-        </w:rPr>
-        <w:t>Figure: Case inbox</w:t>
-      </w:r>
-    </w:p>
-    <w:p>
-      <w:pPr>
-        <w:spacing w:before="60" w:after="240"/>
-        <w:jc w:val="both"/>
-        <w:rPr>
-          <w:rFonts w:asciiTheme="minorHAnsi" w:hAnsiTheme="minorHAnsi"/>
-          <w:b/>
-          <w:bCs/>
-          <w:sz w:val="20"/>
-          <w:szCs w:val="20"/>
-        </w:rPr>
-      </w:pPr>
-      <w:r>
-        <w:rPr>
-          <w:rFonts w:asciiTheme="minorHAnsi" w:hAnsiTheme="minorHAnsi"/>
-          <w:b/>
-          <w:bCs/>
-          <w:sz w:val="20"/>
-          <w:szCs w:val="20"/>
-        </w:rPr>
-        <w:t>Department mapping</w:t>
-      </w:r>
-    </w:p>
-    <w:p>
-      <w:pPr>
-        <w:spacing w:before="60" w:after="240"/>
-        <w:jc w:val="both"/>
-        <w:rPr>
-          <w:rFonts w:asciiTheme="minorHAnsi" w:hAnsiTheme="minorHAnsi"/>
-          <w:sz w:val="20"/>
-          <w:szCs w:val="20"/>
-        </w:rPr>
-      </w:pPr>
-      <w:r>
-        <w:rPr>
-          <w:rFonts w:asciiTheme="minorHAnsi" w:hAnsiTheme="minorHAnsi"/>
-          <w:sz w:val="20"/>
-          <w:szCs w:val="20"/>
-        </w:rPr>
-        <w:t>The administration screen where standing counsel codes, as they appear in the cause list, are mapped to departments (Sections 4.1 and 5.11).</w:t>
-      </w:r>
-    </w:p>
-    <w:p>
-      <w:pPr>
-        <w:spacing w:before="60" w:after="240"/>
-        <w:jc w:val="center"/>
-        <w:rPr>
-          <w:rFonts w:asciiTheme="minorHAnsi" w:hAnsiTheme="minorHAnsi"/>
-          <w:sz w:val="20"/>
-          <w:szCs w:val="20"/>
-        </w:rPr>
-      </w:pPr>
-      <w:r>
-        <w:rPr>
-          <w:rFonts w:asciiTheme="minorHAnsi" w:hAnsiTheme="minorHAnsi"/>
-          <w:sz w:val="20"/>
-          <w:szCs w:val="20"/>
-        </w:rPr>
-        <w:drawing>
-          <wp:inline distT="0" distB="0" distL="0" distR="0" wp14:anchorId="7BA2422A" wp14:editId="2AD953B4">
-            <wp:extent cx="3646651" cy="2736000"/>
-            <wp:effectExtent l="0" t="0" r="0" b="7620"/>
-            <wp:docPr id="10719793" name="Picture 10"/>
-            <wp:cNvGraphicFramePr>
-              <a:graphicFrameLocks xmlns:a="http://schemas.openxmlformats.org/drawingml/2006/main" noChangeAspect="1"/>
-            </wp:cNvGraphicFramePr>
-            <a:graphic xmlns:a="http://schemas.openxmlformats.org/drawingml/2006/main">
-              <a:graphicData uri="http://schemas.openxmlformats.org/drawingml/2006/picture">
-                <pic:pic xmlns:pic="http://schemas.openxmlformats.org/drawingml/2006/picture">
-                  <pic:nvPicPr>
-                    <pic:cNvPr id="0" name="Picture 1377140078"/>
                     <pic:cNvPicPr>
                       <a:picLocks noChangeAspect="1" noChangeArrowheads="1"/>
                     </pic:cNvPicPr>
@@ -16361,7 +15582,7 @@
           <w:sz w:val="20"/>
           <w:szCs w:val="20"/>
         </w:rPr>
-        <w:t>Figure: Department mapping</w:t>
+        <w:t>Figure: Case inbox</w:t>
       </w:r>
     </w:p>
     <w:p>
@@ -16376,11 +15597,7 @@
           <w:szCs w:val="20"/>
         </w:rPr>
       </w:pPr>
-    </w:p>
-    <w:p>
-      <w:pPr>
-        <w:spacing w:before="60" w:after="240"/>
-        <w:jc w:val="both"/>
+      <w:r>
         <w:rPr>
           <w:rFonts w:asciiTheme="minorHAnsi" w:hAnsiTheme="minorHAnsi"/>
           <w:b/>
@@ -16388,7 +15605,8 @@
           <w:sz w:val="20"/>
           <w:szCs w:val="20"/>
         </w:rPr>
-      </w:pPr>
+        <w:t>Department mapping</w:t>
+      </w:r>
     </w:p>
     <w:p>
       <w:pPr>
@@ -16396,41 +15614,17 @@
         <w:jc w:val="both"/>
         <w:rPr>
           <w:rFonts w:asciiTheme="minorHAnsi" w:hAnsiTheme="minorHAnsi"/>
-          <w:b/>
-          <w:bCs/>
-          <w:sz w:val="20"/>
-          <w:szCs w:val="20"/>
-        </w:rPr>
-      </w:pPr>
-      <w:r>
-        <w:rPr>
-          <w:rFonts w:asciiTheme="minorHAnsi" w:hAnsiTheme="minorHAnsi"/>
-          <w:b/>
-          <w:bCs/>
-          <w:sz w:val="20"/>
-          <w:szCs w:val="20"/>
-        </w:rPr>
-        <w:lastRenderedPageBreak/>
-        <w:t>Case detail</w:t>
-      </w:r>
-    </w:p>
-    <w:p>
-      <w:pPr>
-        <w:spacing w:before="60" w:after="240"/>
-        <w:jc w:val="both"/>
-        <w:rPr>
-          <w:rFonts w:asciiTheme="minorHAnsi" w:hAnsiTheme="minorHAnsi"/>
-          <w:sz w:val="20"/>
-          <w:szCs w:val="20"/>
-        </w:rPr>
-      </w:pPr>
-      <w:r>
-        <w:rPr>
-          <w:rFonts w:asciiTheme="minorHAnsi" w:hAnsiTheme="minorHAnsi"/>
-          <w:sz w:val="20"/>
-          <w:szCs w:val="20"/>
-        </w:rPr>
-        <w:t>The overview of a case: next hearing, parties and advocates, proceedings, current custody and pending action, the latest order with the next date read by SourceTrace, and ownership (Sections 5.3 and 5.7).</w:t>
+          <w:sz w:val="20"/>
+          <w:szCs w:val="20"/>
+        </w:rPr>
+      </w:pPr>
+      <w:r>
+        <w:rPr>
+          <w:rFonts w:asciiTheme="minorHAnsi" w:hAnsiTheme="minorHAnsi"/>
+          <w:sz w:val="20"/>
+          <w:szCs w:val="20"/>
+        </w:rPr>
+        <w:t>The administration screen where standing counsel codes, as they appear in the cause list, are mapped to departments (Sections 4.1 and 5.11).</w:t>
       </w:r>
     </w:p>
     <w:p>
@@ -16446,14 +15640,15 @@
       <w:r>
         <w:rPr>
           <w:rFonts w:asciiTheme="minorHAnsi" w:hAnsiTheme="minorHAnsi"/>
+          <w:noProof/>
           <w:sz w:val="20"/>
           <w:szCs w:val="20"/>
         </w:rPr>
         <w:drawing>
-          <wp:inline distT="0" distB="0" distL="0" distR="0" wp14:anchorId="1AD13C2C" wp14:editId="6E89784F">
+          <wp:inline distT="0" distB="0" distL="0" distR="0" wp14:anchorId="7BA2422A" wp14:editId="2AD953B4">
             <wp:extent cx="3646651" cy="2736000"/>
             <wp:effectExtent l="0" t="0" r="0" b="7620"/>
-            <wp:docPr id="1743127934" name="Picture 9"/>
+            <wp:docPr id="10719793" name="Picture 10"/>
             <wp:cNvGraphicFramePr>
               <a:graphicFrameLocks xmlns:a="http://schemas.openxmlformats.org/drawingml/2006/main" noChangeAspect="1"/>
             </wp:cNvGraphicFramePr>
@@ -16461,7 +15656,7 @@
               <a:graphicData uri="http://schemas.openxmlformats.org/drawingml/2006/picture">
                 <pic:pic xmlns:pic="http://schemas.openxmlformats.org/drawingml/2006/picture">
                   <pic:nvPicPr>
-                    <pic:cNvPr id="0" name="Picture 333035225"/>
+                    <pic:cNvPr id="0" name="Picture 1377140078"/>
                     <pic:cNvPicPr>
                       <a:picLocks noChangeAspect="1" noChangeArrowheads="1"/>
                     </pic:cNvPicPr>
@@ -16517,7 +15712,7 @@
           <w:sz w:val="20"/>
           <w:szCs w:val="20"/>
         </w:rPr>
-        <w:t>Figure: Case detail</w:t>
+        <w:t>Figure: Department mapping</w:t>
       </w:r>
     </w:p>
     <w:p>
@@ -16532,7 +15727,11 @@
           <w:szCs w:val="20"/>
         </w:rPr>
       </w:pPr>
-      <w:r>
+    </w:p>
+    <w:p>
+      <w:pPr>
+        <w:spacing w:before="60" w:after="240"/>
+        <w:jc w:val="both"/>
         <w:rPr>
           <w:rFonts w:asciiTheme="minorHAnsi" w:hAnsiTheme="minorHAnsi"/>
           <w:b/>
@@ -16540,8 +15739,7 @@
           <w:sz w:val="20"/>
           <w:szCs w:val="20"/>
         </w:rPr>
-        <w:t>Case documents and upload</w:t>
-      </w:r>
+      </w:pPr>
     </w:p>
     <w:p>
       <w:pPr>
@@ -16549,17 +15747,41 @@
         <w:jc w:val="both"/>
         <w:rPr>
           <w:rFonts w:asciiTheme="minorHAnsi" w:hAnsiTheme="minorHAnsi"/>
-          <w:sz w:val="20"/>
-          <w:szCs w:val="20"/>
-        </w:rPr>
-      </w:pPr>
-      <w:r>
-        <w:rPr>
-          <w:rFonts w:asciiTheme="minorHAnsi" w:hAnsiTheme="minorHAnsi"/>
-          <w:sz w:val="20"/>
-          <w:szCs w:val="20"/>
-        </w:rPr>
-        <w:t>Court orders, court filings and internal documents of a case, each marked with whether it is available to the Case Assistant and who can see it, with the upload panel alongside (Section 5.6).</w:t>
+          <w:b/>
+          <w:bCs/>
+          <w:sz w:val="20"/>
+          <w:szCs w:val="20"/>
+        </w:rPr>
+      </w:pPr>
+      <w:r>
+        <w:rPr>
+          <w:rFonts w:asciiTheme="minorHAnsi" w:hAnsiTheme="minorHAnsi"/>
+          <w:b/>
+          <w:bCs/>
+          <w:sz w:val="20"/>
+          <w:szCs w:val="20"/>
+        </w:rPr>
+        <w:lastRenderedPageBreak/>
+        <w:t>Case detail</w:t>
+      </w:r>
+    </w:p>
+    <w:p>
+      <w:pPr>
+        <w:spacing w:before="60" w:after="240"/>
+        <w:jc w:val="both"/>
+        <w:rPr>
+          <w:rFonts w:asciiTheme="minorHAnsi" w:hAnsiTheme="minorHAnsi"/>
+          <w:sz w:val="20"/>
+          <w:szCs w:val="20"/>
+        </w:rPr>
+      </w:pPr>
+      <w:r>
+        <w:rPr>
+          <w:rFonts w:asciiTheme="minorHAnsi" w:hAnsiTheme="minorHAnsi"/>
+          <w:sz w:val="20"/>
+          <w:szCs w:val="20"/>
+        </w:rPr>
+        <w:t>The overview of a case: next hearing, parties and advocates, proceedings, current custody and pending action, the latest order with the next date read by SourceTrace, and ownership (Sections 5.3 and 5.7).</w:t>
       </w:r>
     </w:p>
     <w:p>
@@ -16575,14 +15797,15 @@
       <w:r>
         <w:rPr>
           <w:rFonts w:asciiTheme="minorHAnsi" w:hAnsiTheme="minorHAnsi"/>
+          <w:noProof/>
           <w:sz w:val="20"/>
           <w:szCs w:val="20"/>
         </w:rPr>
         <w:drawing>
-          <wp:inline distT="0" distB="0" distL="0" distR="0" wp14:anchorId="67FE21A6" wp14:editId="1ACE11B1">
+          <wp:inline distT="0" distB="0" distL="0" distR="0" wp14:anchorId="1AD13C2C" wp14:editId="6E89784F">
             <wp:extent cx="3646651" cy="2736000"/>
             <wp:effectExtent l="0" t="0" r="0" b="7620"/>
-            <wp:docPr id="1424679315" name="Picture 8"/>
+            <wp:docPr id="1743127934" name="Picture 9"/>
             <wp:cNvGraphicFramePr>
               <a:graphicFrameLocks xmlns:a="http://schemas.openxmlformats.org/drawingml/2006/main" noChangeAspect="1"/>
             </wp:cNvGraphicFramePr>
@@ -16590,7 +15813,7 @@
               <a:graphicData uri="http://schemas.openxmlformats.org/drawingml/2006/picture">
                 <pic:pic xmlns:pic="http://schemas.openxmlformats.org/drawingml/2006/picture">
                   <pic:nvPicPr>
-                    <pic:cNvPr id="0" name="Picture 849051168"/>
+                    <pic:cNvPr id="0" name="Picture 333035225"/>
                     <pic:cNvPicPr>
                       <a:picLocks noChangeAspect="1" noChangeArrowheads="1"/>
                     </pic:cNvPicPr>
@@ -16646,7 +15869,7 @@
           <w:sz w:val="20"/>
           <w:szCs w:val="20"/>
         </w:rPr>
-        <w:t>Figure: Case documents and upload</w:t>
+        <w:t>Figure: Case detail</w:t>
       </w:r>
     </w:p>
     <w:p>
@@ -16661,11 +15884,7 @@
           <w:szCs w:val="20"/>
         </w:rPr>
       </w:pPr>
-    </w:p>
-    <w:p>
-      <w:pPr>
-        <w:spacing w:before="60" w:after="240"/>
-        <w:jc w:val="both"/>
+      <w:r>
         <w:rPr>
           <w:rFonts w:asciiTheme="minorHAnsi" w:hAnsiTheme="minorHAnsi"/>
           <w:b/>
@@ -16673,7 +15892,8 @@
           <w:sz w:val="20"/>
           <w:szCs w:val="20"/>
         </w:rPr>
-      </w:pPr>
+        <w:t>Case documents and upload</w:t>
+      </w:r>
     </w:p>
     <w:p>
       <w:pPr>
@@ -16681,54 +15901,17 @@
         <w:jc w:val="both"/>
         <w:rPr>
           <w:rFonts w:asciiTheme="minorHAnsi" w:hAnsiTheme="minorHAnsi"/>
-          <w:b/>
-          <w:bCs/>
-          <w:sz w:val="20"/>
-          <w:szCs w:val="20"/>
-        </w:rPr>
-      </w:pPr>
-    </w:p>
-    <w:p>
-      <w:pPr>
-        <w:spacing w:before="60" w:after="240"/>
-        <w:jc w:val="both"/>
-        <w:rPr>
-          <w:rFonts w:asciiTheme="minorHAnsi" w:hAnsiTheme="minorHAnsi"/>
-          <w:b/>
-          <w:bCs/>
-          <w:sz w:val="20"/>
-          <w:szCs w:val="20"/>
-        </w:rPr>
-      </w:pPr>
-      <w:r>
-        <w:rPr>
-          <w:rFonts w:asciiTheme="minorHAnsi" w:hAnsiTheme="minorHAnsi"/>
-          <w:b/>
-          <w:bCs/>
-          <w:sz w:val="20"/>
-          <w:szCs w:val="20"/>
-        </w:rPr>
-        <w:lastRenderedPageBreak/>
-        <w:t>Case Assistant</w:t>
-      </w:r>
-    </w:p>
-    <w:p>
-      <w:pPr>
-        <w:spacing w:before="60" w:after="240"/>
-        <w:jc w:val="both"/>
-        <w:rPr>
-          <w:rFonts w:asciiTheme="minorHAnsi" w:hAnsiTheme="minorHAnsi"/>
-          <w:sz w:val="20"/>
-          <w:szCs w:val="20"/>
-        </w:rPr>
-      </w:pPr>
-      <w:r>
-        <w:rPr>
-          <w:rFonts w:asciiTheme="minorHAnsi" w:hAnsiTheme="minorHAnsi"/>
-          <w:sz w:val="20"/>
-          <w:szCs w:val="20"/>
-        </w:rPr>
-        <w:t>The AI chat on a case page, powered by SourceTrace. Answers cite their sources and can be copied into a case note; the side panel shows the sources used (Section 5.9).</w:t>
+          <w:sz w:val="20"/>
+          <w:szCs w:val="20"/>
+        </w:rPr>
+      </w:pPr>
+      <w:r>
+        <w:rPr>
+          <w:rFonts w:asciiTheme="minorHAnsi" w:hAnsiTheme="minorHAnsi"/>
+          <w:sz w:val="20"/>
+          <w:szCs w:val="20"/>
+        </w:rPr>
+        <w:t>Court orders, court filings and internal documents of a case, each marked with whether it is available to the Case Assistant and who can see it, with the upload panel alongside (Section 5.6).</w:t>
       </w:r>
     </w:p>
     <w:p>
@@ -16744,14 +15927,15 @@
       <w:r>
         <w:rPr>
           <w:rFonts w:asciiTheme="minorHAnsi" w:hAnsiTheme="minorHAnsi"/>
+          <w:noProof/>
           <w:sz w:val="20"/>
           <w:szCs w:val="20"/>
         </w:rPr>
         <w:drawing>
-          <wp:inline distT="0" distB="0" distL="0" distR="0" wp14:anchorId="1B5DC9F4" wp14:editId="1F0B97DF">
+          <wp:inline distT="0" distB="0" distL="0" distR="0" wp14:anchorId="67FE21A6" wp14:editId="1ACE11B1">
             <wp:extent cx="3646651" cy="2736000"/>
             <wp:effectExtent l="0" t="0" r="0" b="7620"/>
-            <wp:docPr id="1924463175" name="Picture 7"/>
+            <wp:docPr id="1424679315" name="Picture 8"/>
             <wp:cNvGraphicFramePr>
               <a:graphicFrameLocks xmlns:a="http://schemas.openxmlformats.org/drawingml/2006/main" noChangeAspect="1"/>
             </wp:cNvGraphicFramePr>
@@ -16759,7 +15943,7 @@
               <a:graphicData uri="http://schemas.openxmlformats.org/drawingml/2006/picture">
                 <pic:pic xmlns:pic="http://schemas.openxmlformats.org/drawingml/2006/picture">
                   <pic:nvPicPr>
-                    <pic:cNvPr id="0" name="Picture 1535708388"/>
+                    <pic:cNvPr id="0" name="Picture 849051168"/>
                     <pic:cNvPicPr>
                       <a:picLocks noChangeAspect="1" noChangeArrowheads="1"/>
                     </pic:cNvPicPr>
@@ -16815,6 +15999,176 @@
           <w:sz w:val="20"/>
           <w:szCs w:val="20"/>
         </w:rPr>
+        <w:t>Figure: Case documents and upload</w:t>
+      </w:r>
+    </w:p>
+    <w:p>
+      <w:pPr>
+        <w:spacing w:before="60" w:after="240"/>
+        <w:jc w:val="both"/>
+        <w:rPr>
+          <w:rFonts w:asciiTheme="minorHAnsi" w:hAnsiTheme="minorHAnsi"/>
+          <w:b/>
+          <w:bCs/>
+          <w:sz w:val="20"/>
+          <w:szCs w:val="20"/>
+        </w:rPr>
+      </w:pPr>
+    </w:p>
+    <w:p>
+      <w:pPr>
+        <w:spacing w:before="60" w:after="240"/>
+        <w:jc w:val="both"/>
+        <w:rPr>
+          <w:rFonts w:asciiTheme="minorHAnsi" w:hAnsiTheme="minorHAnsi"/>
+          <w:b/>
+          <w:bCs/>
+          <w:sz w:val="20"/>
+          <w:szCs w:val="20"/>
+        </w:rPr>
+      </w:pPr>
+    </w:p>
+    <w:p>
+      <w:pPr>
+        <w:spacing w:before="60" w:after="240"/>
+        <w:jc w:val="both"/>
+        <w:rPr>
+          <w:rFonts w:asciiTheme="minorHAnsi" w:hAnsiTheme="minorHAnsi"/>
+          <w:b/>
+          <w:bCs/>
+          <w:sz w:val="20"/>
+          <w:szCs w:val="20"/>
+        </w:rPr>
+      </w:pPr>
+    </w:p>
+    <w:p>
+      <w:pPr>
+        <w:spacing w:before="60" w:after="240"/>
+        <w:jc w:val="both"/>
+        <w:rPr>
+          <w:rFonts w:asciiTheme="minorHAnsi" w:hAnsiTheme="minorHAnsi"/>
+          <w:b/>
+          <w:bCs/>
+          <w:sz w:val="20"/>
+          <w:szCs w:val="20"/>
+        </w:rPr>
+      </w:pPr>
+      <w:r>
+        <w:rPr>
+          <w:rFonts w:asciiTheme="minorHAnsi" w:hAnsiTheme="minorHAnsi"/>
+          <w:b/>
+          <w:bCs/>
+          <w:sz w:val="20"/>
+          <w:szCs w:val="20"/>
+        </w:rPr>
+        <w:lastRenderedPageBreak/>
+        <w:t>Case Assistant</w:t>
+      </w:r>
+    </w:p>
+    <w:p>
+      <w:pPr>
+        <w:spacing w:before="60" w:after="240"/>
+        <w:jc w:val="both"/>
+        <w:rPr>
+          <w:rFonts w:asciiTheme="minorHAnsi" w:hAnsiTheme="minorHAnsi"/>
+          <w:sz w:val="20"/>
+          <w:szCs w:val="20"/>
+        </w:rPr>
+      </w:pPr>
+      <w:r>
+        <w:rPr>
+          <w:rFonts w:asciiTheme="minorHAnsi" w:hAnsiTheme="minorHAnsi"/>
+          <w:sz w:val="20"/>
+          <w:szCs w:val="20"/>
+        </w:rPr>
+        <w:t>The AI chat on a case page, powered by SourceTrace. Answers cite their sources and can be copied into a case note; the side panel shows the sources used (Section 5.9).</w:t>
+      </w:r>
+    </w:p>
+    <w:p>
+      <w:pPr>
+        <w:spacing w:before="60" w:after="240"/>
+        <w:jc w:val="center"/>
+        <w:rPr>
+          <w:rFonts w:asciiTheme="minorHAnsi" w:hAnsiTheme="minorHAnsi"/>
+          <w:sz w:val="20"/>
+          <w:szCs w:val="20"/>
+        </w:rPr>
+      </w:pPr>
+      <w:r>
+        <w:rPr>
+          <w:rFonts w:asciiTheme="minorHAnsi" w:hAnsiTheme="minorHAnsi"/>
+          <w:noProof/>
+          <w:sz w:val="20"/>
+          <w:szCs w:val="20"/>
+        </w:rPr>
+        <w:drawing>
+          <wp:inline distT="0" distB="0" distL="0" distR="0" wp14:anchorId="1B5DC9F4" wp14:editId="1F0B97DF">
+            <wp:extent cx="3646651" cy="2736000"/>
+            <wp:effectExtent l="0" t="0" r="0" b="7620"/>
+            <wp:docPr id="1924463175" name="Picture 7"/>
+            <wp:cNvGraphicFramePr>
+              <a:graphicFrameLocks xmlns:a="http://schemas.openxmlformats.org/drawingml/2006/main" noChangeAspect="1"/>
+            </wp:cNvGraphicFramePr>
+            <a:graphic xmlns:a="http://schemas.openxmlformats.org/drawingml/2006/main">
+              <a:graphicData uri="http://schemas.openxmlformats.org/drawingml/2006/picture">
+                <pic:pic xmlns:pic="http://schemas.openxmlformats.org/drawingml/2006/picture">
+                  <pic:nvPicPr>
+                    <pic:cNvPr id="0" name="Picture 1535708388"/>
+                    <pic:cNvPicPr>
+                      <a:picLocks noChangeAspect="1" noChangeArrowheads="1"/>
+                    </pic:cNvPicPr>
+                  </pic:nvPicPr>
+                  <pic:blipFill>
+                    <a:blip r:embed="rId20" cstate="print">
+                      <a:extLst>
+                        <a:ext uri="{28A0092B-C50C-407E-A947-70E740481C1C}">
+                          <a14:useLocalDpi xmlns:a14="http://schemas.microsoft.com/office/drawing/2010/main" val="0"/>
+                        </a:ext>
+                      </a:extLst>
+                    </a:blip>
+                    <a:srcRect/>
+                    <a:stretch>
+                      <a:fillRect/>
+                    </a:stretch>
+                  </pic:blipFill>
+                  <pic:spPr bwMode="auto">
+                    <a:xfrm>
+                      <a:off x="0" y="0"/>
+                      <a:ext cx="3646651" cy="2736000"/>
+                    </a:xfrm>
+                    <a:prstGeom prst="rect">
+                      <a:avLst/>
+                    </a:prstGeom>
+                    <a:noFill/>
+                    <a:ln>
+                      <a:noFill/>
+                    </a:ln>
+                  </pic:spPr>
+                </pic:pic>
+              </a:graphicData>
+            </a:graphic>
+          </wp:inline>
+        </w:drawing>
+      </w:r>
+    </w:p>
+    <w:p>
+      <w:pPr>
+        <w:spacing w:before="60" w:after="240"/>
+        <w:jc w:val="center"/>
+        <w:rPr>
+          <w:rFonts w:asciiTheme="minorHAnsi" w:hAnsiTheme="minorHAnsi"/>
+          <w:sz w:val="20"/>
+          <w:szCs w:val="20"/>
+        </w:rPr>
+      </w:pPr>
+      <w:r>
+        <w:rPr>
+          <w:rFonts w:asciiTheme="minorHAnsi" w:hAnsiTheme="minorHAnsi"/>
+          <w:i/>
+          <w:iCs/>
+          <w:sz w:val="20"/>
+          <w:szCs w:val="20"/>
+        </w:rPr>
         <w:t>Figure: Case Assistant</w:t>
       </w:r>
     </w:p>
@@ -16830,7 +16184,7 @@
       </w:pPr>
     </w:p>
     <w:sectPr>
-      <w:footerReference w:type="default" r:id="rId20"/>
+      <w:footerReference w:type="default" r:id="rId21"/>
       <w:pgSz w:w="11906" w:h="16838"/>
       <w:pgMar w:top="1440" w:right="1440" w:bottom="1440" w:left="1440" w:header="708" w:footer="708" w:gutter="0"/>
       <w:cols w:space="720"/>
@@ -17582,6 +16936,7 @@
   <w:style w:type="character" w:default="1" w:styleId="DefaultParagraphFont">
     <w:name w:val="Default Paragraph Font"/>
     <w:uiPriority w:val="1"/>
+    <w:semiHidden/>
     <w:unhideWhenUsed/>
   </w:style>
   <w:style w:type="table" w:default="1" w:styleId="TableNormal">
@@ -18013,4 +17368,16 @@
     </a:ext>
   </a:extLst>
 </a:theme>
+</file>
+
+<file path=customXml/item1.xml><?xml version="1.0" encoding="utf-8"?>
+<b:Sources xmlns:b="http://schemas.openxmlformats.org/officeDocument/2006/bibliography" xmlns="http://schemas.openxmlformats.org/officeDocument/2006/bibliography" SelectedStyle="\APASixthEditionOfficeOnline.xsl" StyleName="APA" Version="6"/>
+</file>
+
+<file path=customXml/itemProps1.xml><?xml version="1.0" encoding="utf-8"?>
+<ds:datastoreItem xmlns:ds="http://schemas.openxmlformats.org/officeDocument/2006/customXml" ds:itemID="{E4B91B5E-3303-43DA-AF45-975B2743EFA2}">
+  <ds:schemaRefs>
+    <ds:schemaRef ds:uri="http://schemas.openxmlformats.org/officeDocument/2006/bibliography"/>
+  </ds:schemaRefs>
+</ds:datastoreItem>
 </file>
</xml_diff>